<commit_message>
Test plan BRD-1 New Business; builder sorts BRD IDs and halves long tables
brd01_cases.yaml covers the 93 FRs of FRS BRD-1 with 237 conditions and 386
cases, 311 of them tied to existing automated tests, plus the roles-and-access
checks and seven FRS findings. The builder now drops page notes from BRD
references, sorts BRD IDs by number and sets long coverage tables side by
side so the Word summary stays within 20 pages.

Co-Authored-By: Claude Opus 5.5 <noreply@anthropic.com>
Claude-Session: https://claude.ai/code/session_01W3DAuLtsQmip7EuxjJCCtN
</commit_message>
<xml_diff>
--- a/docs/deliverables/out/TestPlans/BIBS_TestPlan_BRD-03_Product_Maintenance_Summary_v1.0.docx
+++ b/docs/deliverables/out/TestPlans/BIBS_TestPlan_BRD-03_Product_Maintenance_Summary_v1.0.docx
@@ -2168,7 +2168,7 @@
           <w:t xml:space="preserve">	</w:t>
         </w:r>
         <w:r>
-          <w:t xml:space="preserve">15</w:t>
+          <w:t xml:space="preserve">14</w:t>
         </w:r>
       </w:hyperlink>
     </w:p>
@@ -17833,7 +17833,7 @@
               <w:rPr>
                 <w:sz w:val="16"/>
               </w:rPr>
-              <w:t>PMADD05</w:t>
+              <w:t>BRPM.003</w:t>
             </w:r>
           </w:p>
         </w:tc>
@@ -17855,7 +17855,7 @@
               <w:rPr>
                 <w:sz w:val="16"/>
               </w:rPr>
-              <w:t>FR-PM-002, FR-PM-003</w:t>
+              <w:t>FR-PM-012</w:t>
             </w:r>
           </w:p>
         </w:tc>
@@ -17877,7 +17877,7 @@
               <w:rPr>
                 <w:sz w:val="16"/>
               </w:rPr>
-              <w:t>8</w:t>
+              <w:t>3</w:t>
             </w:r>
           </w:p>
         </w:tc>
@@ -17899,51 +17899,51 @@
               <w:rPr>
                 <w:sz w:val="16"/>
               </w:rPr>
+              <w:t>2</w:t>
+            </w:r>
+          </w:p>
+        </w:tc>
+        <w:tc>
+          <w:tcPr>
+            <w:tcW w:type="dxa" w:w="928"/>
+            <w:tcMar>
+              <w:top w:w="50" w:type="dxa"/>
+              <w:bottom w:w="50" w:type="dxa"/>
+              <w:left w:w="90" w:type="dxa"/>
+              <w:right w:w="90" w:type="dxa"/>
+            </w:tcMar>
+          </w:tcPr>
+          <w:p>
+            <w:pPr>
+              <w:pStyle w:val="BDOITable"/>
+            </w:pPr>
+            <w:r>
+              <w:rPr>
+                <w:sz w:val="16"/>
+              </w:rPr>
+              <w:t>2</w:t>
+            </w:r>
+          </w:p>
+        </w:tc>
+        <w:tc>
+          <w:tcPr>
+            <w:tcW w:type="dxa" w:w="928"/>
+            <w:tcMar>
+              <w:top w:w="50" w:type="dxa"/>
+              <w:bottom w:w="50" w:type="dxa"/>
+              <w:left w:w="90" w:type="dxa"/>
+              <w:right w:w="90" w:type="dxa"/>
+            </w:tcMar>
+          </w:tcPr>
+          <w:p>
+            <w:pPr>
+              <w:pStyle w:val="BDOITable"/>
+            </w:pPr>
+            <w:r>
+              <w:rPr>
+                <w:sz w:val="16"/>
+              </w:rPr>
               <w:t>4</w:t>
-            </w:r>
-          </w:p>
-        </w:tc>
-        <w:tc>
-          <w:tcPr>
-            <w:tcW w:type="dxa" w:w="928"/>
-            <w:tcMar>
-              <w:top w:w="50" w:type="dxa"/>
-              <w:bottom w:w="50" w:type="dxa"/>
-              <w:left w:w="90" w:type="dxa"/>
-              <w:right w:w="90" w:type="dxa"/>
-            </w:tcMar>
-          </w:tcPr>
-          <w:p>
-            <w:pPr>
-              <w:pStyle w:val="BDOITable"/>
-            </w:pPr>
-            <w:r>
-              <w:rPr>
-                <w:sz w:val="16"/>
-              </w:rPr>
-              <w:t>8</w:t>
-            </w:r>
-          </w:p>
-        </w:tc>
-        <w:tc>
-          <w:tcPr>
-            <w:tcW w:type="dxa" w:w="928"/>
-            <w:tcMar>
-              <w:top w:w="50" w:type="dxa"/>
-              <w:bottom w:w="50" w:type="dxa"/>
-              <w:left w:w="90" w:type="dxa"/>
-              <w:right w:w="90" w:type="dxa"/>
-            </w:tcMar>
-          </w:tcPr>
-          <w:p>
-            <w:pPr>
-              <w:pStyle w:val="BDOITable"/>
-            </w:pPr>
-            <w:r>
-              <w:rPr>
-                <w:sz w:val="16"/>
-              </w:rPr>
-              <w:t>12</w:t>
             </w:r>
           </w:p>
         </w:tc>
@@ -17971,7 +17971,7 @@
               <w:rPr>
                 <w:sz w:val="16"/>
               </w:rPr>
-              <w:t>BRPM.020</w:t>
+              <w:t>BRPM.004</w:t>
             </w:r>
           </w:p>
         </w:tc>
@@ -17994,7 +17994,7 @@
               <w:rPr>
                 <w:sz w:val="16"/>
               </w:rPr>
-              <w:t>FR-PM-004</w:t>
+              <w:t>FR-PM-012</w:t>
             </w:r>
           </w:p>
         </w:tc>
@@ -18040,6 +18040,29 @@
               <w:rPr>
                 <w:sz w:val="16"/>
               </w:rPr>
+              <w:t>1</w:t>
+            </w:r>
+          </w:p>
+        </w:tc>
+        <w:tc>
+          <w:tcPr>
+            <w:tcW w:type="dxa" w:w="928"/>
+            <w:tcMar>
+              <w:top w:w="50" w:type="dxa"/>
+              <w:bottom w:w="50" w:type="dxa"/>
+              <w:left w:w="90" w:type="dxa"/>
+              <w:right w:w="90" w:type="dxa"/>
+            </w:tcMar>
+            <w:shd w:val="clear" w:color="auto" w:fill="E5F5FF"/>
+          </w:tcPr>
+          <w:p>
+            <w:pPr>
+              <w:pStyle w:val="BDOITable"/>
+            </w:pPr>
+            <w:r>
+              <w:rPr>
+                <w:sz w:val="16"/>
+              </w:rPr>
               <w:t>2</w:t>
             </w:r>
           </w:p>
@@ -18063,30 +18086,7 @@
               <w:rPr>
                 <w:sz w:val="16"/>
               </w:rPr>
-              <w:t>2</w:t>
-            </w:r>
-          </w:p>
-        </w:tc>
-        <w:tc>
-          <w:tcPr>
-            <w:tcW w:type="dxa" w:w="928"/>
-            <w:tcMar>
-              <w:top w:w="50" w:type="dxa"/>
-              <w:bottom w:w="50" w:type="dxa"/>
-              <w:left w:w="90" w:type="dxa"/>
-              <w:right w:w="90" w:type="dxa"/>
-            </w:tcMar>
-            <w:shd w:val="clear" w:color="auto" w:fill="E5F5FF"/>
-          </w:tcPr>
-          <w:p>
-            <w:pPr>
-              <w:pStyle w:val="BDOITable"/>
-            </w:pPr>
-            <w:r>
-              <w:rPr>
-                <w:sz w:val="16"/>
-              </w:rPr>
-              <w:t>4</w:t>
+              <w:t>3</w:t>
             </w:r>
           </w:p>
         </w:tc>
@@ -18113,7 +18113,7 @@
               <w:rPr>
                 <w:sz w:val="16"/>
               </w:rPr>
-              <w:t>BRPM.024</w:t>
+              <w:t>BRPM.005</w:t>
             </w:r>
           </w:p>
         </w:tc>
@@ -18135,7 +18135,7 @@
               <w:rPr>
                 <w:sz w:val="16"/>
               </w:rPr>
-              <w:t>FR-PM-005</w:t>
+              <w:t>FR-PM-013</w:t>
             </w:r>
           </w:p>
         </w:tc>
@@ -18251,7 +18251,7 @@
               <w:rPr>
                 <w:sz w:val="16"/>
               </w:rPr>
-              <w:t>PMADD01</w:t>
+              <w:t>BRPM.006</w:t>
             </w:r>
           </w:p>
         </w:tc>
@@ -18274,7 +18274,7 @@
               <w:rPr>
                 <w:sz w:val="16"/>
               </w:rPr>
-              <w:t>FR-PM-010</w:t>
+              <w:t>FR-PM-045, FR-PM-052, FR-PM-071</w:t>
             </w:r>
           </w:p>
         </w:tc>
@@ -18297,7 +18297,7 @@
               <w:rPr>
                 <w:sz w:val="16"/>
               </w:rPr>
-              <w:t>4</w:t>
+              <w:t>9</w:t>
             </w:r>
           </w:p>
         </w:tc>
@@ -18320,7 +18320,7 @@
               <w:rPr>
                 <w:sz w:val="16"/>
               </w:rPr>
-              <w:t>2</w:t>
+              <w:t>7</w:t>
             </w:r>
           </w:p>
         </w:tc>
@@ -18343,7 +18343,7 @@
               <w:rPr>
                 <w:sz w:val="16"/>
               </w:rPr>
-              <w:t>5</w:t>
+              <w:t>7</w:t>
             </w:r>
           </w:p>
         </w:tc>
@@ -18366,7 +18366,7 @@
               <w:rPr>
                 <w:sz w:val="16"/>
               </w:rPr>
-              <w:t>7</w:t>
+              <w:t>14</w:t>
             </w:r>
           </w:p>
         </w:tc>
@@ -18393,7 +18393,7 @@
               <w:rPr>
                 <w:sz w:val="16"/>
               </w:rPr>
-              <w:t>PMADD02</w:t>
+              <w:t>BRPM.007</w:t>
             </w:r>
           </w:p>
         </w:tc>
@@ -18415,7 +18415,7 @@
               <w:rPr>
                 <w:sz w:val="16"/>
               </w:rPr>
-              <w:t>FR-PM-011, FR-PM-014</w:t>
+              <w:t>FR-PM-050, FR-PM-051</w:t>
             </w:r>
           </w:p>
         </w:tc>
@@ -18459,7 +18459,7 @@
               <w:rPr>
                 <w:sz w:val="16"/>
               </w:rPr>
-              <w:t>4</w:t>
+              <w:t>6</w:t>
             </w:r>
           </w:p>
         </w:tc>
@@ -18503,7 +18503,7 @@
               <w:rPr>
                 <w:sz w:val="16"/>
               </w:rPr>
-              <w:t>10</w:t>
+              <w:t>12</w:t>
             </w:r>
           </w:p>
         </w:tc>
@@ -18531,7 +18531,7 @@
               <w:rPr>
                 <w:sz w:val="16"/>
               </w:rPr>
-              <w:t>BRPM.003</w:t>
+              <w:t>BRPM.008</w:t>
             </w:r>
           </w:p>
         </w:tc>
@@ -18554,7 +18554,7 @@
               <w:rPr>
                 <w:sz w:val="16"/>
               </w:rPr>
-              <w:t>FR-PM-012</w:t>
+              <w:t>FR-PM-020, FR-PM-021</w:t>
             </w:r>
           </w:p>
         </w:tc>
@@ -18577,7 +18577,7 @@
               <w:rPr>
                 <w:sz w:val="16"/>
               </w:rPr>
-              <w:t>3</w:t>
+              <w:t>8</w:t>
             </w:r>
           </w:p>
         </w:tc>
@@ -18600,7 +18600,7 @@
               <w:rPr>
                 <w:sz w:val="16"/>
               </w:rPr>
-              <w:t>2</w:t>
+              <w:t>5</w:t>
             </w:r>
           </w:p>
         </w:tc>
@@ -18623,7 +18623,7 @@
               <w:rPr>
                 <w:sz w:val="16"/>
               </w:rPr>
-              <w:t>2</w:t>
+              <w:t>11</w:t>
             </w:r>
           </w:p>
         </w:tc>
@@ -18646,7 +18646,7 @@
               <w:rPr>
                 <w:sz w:val="16"/>
               </w:rPr>
-              <w:t>4</w:t>
+              <w:t>16</w:t>
             </w:r>
           </w:p>
         </w:tc>
@@ -18673,7 +18673,7 @@
               <w:rPr>
                 <w:sz w:val="16"/>
               </w:rPr>
-              <w:t>BRPM.004</w:t>
+              <w:t>BRPM.009</w:t>
             </w:r>
           </w:p>
         </w:tc>
@@ -18695,7 +18695,7 @@
               <w:rPr>
                 <w:sz w:val="16"/>
               </w:rPr>
-              <w:t>FR-PM-012</w:t>
+              <w:t>FR-PM-022, FR-PM-023</w:t>
             </w:r>
           </w:p>
         </w:tc>
@@ -18717,6 +18717,50 @@
               <w:rPr>
                 <w:sz w:val="16"/>
               </w:rPr>
+              <w:t>6</w:t>
+            </w:r>
+          </w:p>
+        </w:tc>
+        <w:tc>
+          <w:tcPr>
+            <w:tcW w:type="dxa" w:w="928"/>
+            <w:tcMar>
+              <w:top w:w="50" w:type="dxa"/>
+              <w:bottom w:w="50" w:type="dxa"/>
+              <w:left w:w="90" w:type="dxa"/>
+              <w:right w:w="90" w:type="dxa"/>
+            </w:tcMar>
+          </w:tcPr>
+          <w:p>
+            <w:pPr>
+              <w:pStyle w:val="BDOITable"/>
+            </w:pPr>
+            <w:r>
+              <w:rPr>
+                <w:sz w:val="16"/>
+              </w:rPr>
+              <w:t>6</w:t>
+            </w:r>
+          </w:p>
+        </w:tc>
+        <w:tc>
+          <w:tcPr>
+            <w:tcW w:type="dxa" w:w="928"/>
+            <w:tcMar>
+              <w:top w:w="50" w:type="dxa"/>
+              <w:bottom w:w="50" w:type="dxa"/>
+              <w:left w:w="90" w:type="dxa"/>
+              <w:right w:w="90" w:type="dxa"/>
+            </w:tcMar>
+          </w:tcPr>
+          <w:p>
+            <w:pPr>
+              <w:pStyle w:val="BDOITable"/>
+            </w:pPr>
+            <w:r>
+              <w:rPr>
+                <w:sz w:val="16"/>
+              </w:rPr>
               <w:t>3</w:t>
             </w:r>
           </w:p>
@@ -18739,51 +18783,7 @@
               <w:rPr>
                 <w:sz w:val="16"/>
               </w:rPr>
-              <w:t>1</w:t>
-            </w:r>
-          </w:p>
-        </w:tc>
-        <w:tc>
-          <w:tcPr>
-            <w:tcW w:type="dxa" w:w="928"/>
-            <w:tcMar>
-              <w:top w:w="50" w:type="dxa"/>
-              <w:bottom w:w="50" w:type="dxa"/>
-              <w:left w:w="90" w:type="dxa"/>
-              <w:right w:w="90" w:type="dxa"/>
-            </w:tcMar>
-          </w:tcPr>
-          <w:p>
-            <w:pPr>
-              <w:pStyle w:val="BDOITable"/>
-            </w:pPr>
-            <w:r>
-              <w:rPr>
-                <w:sz w:val="16"/>
-              </w:rPr>
-              <w:t>2</w:t>
-            </w:r>
-          </w:p>
-        </w:tc>
-        <w:tc>
-          <w:tcPr>
-            <w:tcW w:type="dxa" w:w="928"/>
-            <w:tcMar>
-              <w:top w:w="50" w:type="dxa"/>
-              <w:bottom w:w="50" w:type="dxa"/>
-              <w:left w:w="90" w:type="dxa"/>
-              <w:right w:w="90" w:type="dxa"/>
-            </w:tcMar>
-          </w:tcPr>
-          <w:p>
-            <w:pPr>
-              <w:pStyle w:val="BDOITable"/>
-            </w:pPr>
-            <w:r>
-              <w:rPr>
-                <w:sz w:val="16"/>
-              </w:rPr>
-              <w:t>3</w:t>
+              <w:t>9</w:t>
             </w:r>
           </w:p>
         </w:tc>
@@ -18811,7 +18811,7 @@
               <w:rPr>
                 <w:sz w:val="16"/>
               </w:rPr>
-              <w:t>BRPM.005</w:t>
+              <w:t>BRPM.010</w:t>
             </w:r>
           </w:p>
         </w:tc>
@@ -18834,7 +18834,7 @@
               <w:rPr>
                 <w:sz w:val="16"/>
               </w:rPr>
-              <w:t>FR-PM-013</w:t>
+              <w:t>FR-PM-032, FR-PM-033, FR-PM-036</w:t>
             </w:r>
           </w:p>
         </w:tc>
@@ -18857,7 +18857,7 @@
               <w:rPr>
                 <w:sz w:val="16"/>
               </w:rPr>
-              <w:t>3</w:t>
+              <w:t>10</w:t>
             </w:r>
           </w:p>
         </w:tc>
@@ -18880,7 +18880,7 @@
               <w:rPr>
                 <w:sz w:val="16"/>
               </w:rPr>
-              <w:t>2</w:t>
+              <w:t>7</w:t>
             </w:r>
           </w:p>
         </w:tc>
@@ -18903,7 +18903,7 @@
               <w:rPr>
                 <w:sz w:val="16"/>
               </w:rPr>
-              <w:t>1</w:t>
+              <w:t>9</w:t>
             </w:r>
           </w:p>
         </w:tc>
@@ -18926,7 +18926,7 @@
               <w:rPr>
                 <w:sz w:val="16"/>
               </w:rPr>
-              <w:t>3</w:t>
+              <w:t>16</w:t>
             </w:r>
           </w:p>
         </w:tc>
@@ -18953,7 +18953,7 @@
               <w:rPr>
                 <w:sz w:val="16"/>
               </w:rPr>
-              <w:t>BRPM.008</w:t>
+              <w:t>BRPM.011</w:t>
             </w:r>
           </w:p>
         </w:tc>
@@ -18975,7 +18975,7 @@
               <w:rPr>
                 <w:sz w:val="16"/>
               </w:rPr>
-              <w:t>FR-PM-020, FR-PM-021</w:t>
+              <w:t>FR-PM-020, FR-PM-024, FR-PM-045</w:t>
             </w:r>
           </w:p>
         </w:tc>
@@ -18997,7 +18997,7 @@
               <w:rPr>
                 <w:sz w:val="16"/>
               </w:rPr>
-              <w:t>8</w:t>
+              <w:t>12</w:t>
             </w:r>
           </w:p>
         </w:tc>
@@ -19019,7 +19019,7 @@
               <w:rPr>
                 <w:sz w:val="16"/>
               </w:rPr>
-              <w:t>5</w:t>
+              <w:t>10</w:t>
             </w:r>
           </w:p>
         </w:tc>
@@ -19041,7 +19041,7 @@
               <w:rPr>
                 <w:sz w:val="16"/>
               </w:rPr>
-              <w:t>11</w:t>
+              <w:t>12</w:t>
             </w:r>
           </w:p>
         </w:tc>
@@ -19063,7 +19063,7 @@
               <w:rPr>
                 <w:sz w:val="16"/>
               </w:rPr>
-              <w:t>16</w:t>
+              <w:t>22</w:t>
             </w:r>
           </w:p>
         </w:tc>
@@ -19091,7 +19091,7 @@
               <w:rPr>
                 <w:sz w:val="16"/>
               </w:rPr>
-              <w:t>BRPM.011</w:t>
+              <w:t>BRPM.012</w:t>
             </w:r>
           </w:p>
         </w:tc>
@@ -19114,7 +19114,7 @@
               <w:rPr>
                 <w:sz w:val="16"/>
               </w:rPr>
-              <w:t>FR-PM-020, FR-PM-024, FR-PM-045</w:t>
+              <w:t>FR-PM-030</w:t>
             </w:r>
           </w:p>
         </w:tc>
@@ -19137,7 +19137,7 @@
               <w:rPr>
                 <w:sz w:val="16"/>
               </w:rPr>
-              <w:t>12</w:t>
+              <w:t>5</w:t>
             </w:r>
           </w:p>
         </w:tc>
@@ -19160,7 +19160,7 @@
               <w:rPr>
                 <w:sz w:val="16"/>
               </w:rPr>
-              <w:t>10</w:t>
+              <w:t>2</w:t>
             </w:r>
           </w:p>
         </w:tc>
@@ -19183,7 +19183,7 @@
               <w:rPr>
                 <w:sz w:val="16"/>
               </w:rPr>
-              <w:t>12</w:t>
+              <w:t>5</w:t>
             </w:r>
           </w:p>
         </w:tc>
@@ -19206,7 +19206,7 @@
               <w:rPr>
                 <w:sz w:val="16"/>
               </w:rPr>
-              <w:t>22</w:t>
+              <w:t>7</w:t>
             </w:r>
           </w:p>
         </w:tc>
@@ -19233,7 +19233,7 @@
               <w:rPr>
                 <w:sz w:val="16"/>
               </w:rPr>
-              <w:t>BRPM.021</w:t>
+              <w:t>BRPM.013</w:t>
             </w:r>
           </w:p>
         </w:tc>
@@ -19255,7 +19255,7 @@
               <w:rPr>
                 <w:sz w:val="16"/>
               </w:rPr>
-              <w:t>FR-PM-021, FR-PM-073</w:t>
+              <w:t>FR-PM-031, FR-PM-034, FR-PM-036</w:t>
             </w:r>
           </w:p>
         </w:tc>
@@ -19277,7 +19277,7 @@
               <w:rPr>
                 <w:sz w:val="16"/>
               </w:rPr>
-              <w:t>6</w:t>
+              <w:t>10</w:t>
             </w:r>
           </w:p>
         </w:tc>
@@ -19299,7 +19299,7 @@
               <w:rPr>
                 <w:sz w:val="16"/>
               </w:rPr>
-              <w:t>4</w:t>
+              <w:t>9</w:t>
             </w:r>
           </w:p>
         </w:tc>
@@ -19321,7 +19321,7 @@
               <w:rPr>
                 <w:sz w:val="16"/>
               </w:rPr>
-              <w:t>6</w:t>
+              <w:t>8</w:t>
             </w:r>
           </w:p>
         </w:tc>
@@ -19343,7 +19343,7 @@
               <w:rPr>
                 <w:sz w:val="16"/>
               </w:rPr>
-              <w:t>10</w:t>
+              <w:t>17</w:t>
             </w:r>
           </w:p>
         </w:tc>
@@ -19371,7 +19371,7 @@
               <w:rPr>
                 <w:sz w:val="16"/>
               </w:rPr>
-              <w:t>BRPM.009</w:t>
+              <w:t>BRPM.014</w:t>
             </w:r>
           </w:p>
         </w:tc>
@@ -19394,7 +19394,7 @@
               <w:rPr>
                 <w:sz w:val="16"/>
               </w:rPr>
-              <w:t>FR-PM-022, FR-PM-023</w:t>
+              <w:t>FR-PM-034</w:t>
             </w:r>
           </w:p>
         </w:tc>
@@ -19417,7 +19417,7 @@
               <w:rPr>
                 <w:sz w:val="16"/>
               </w:rPr>
-              <w:t>6</w:t>
+              <w:t>4</w:t>
             </w:r>
           </w:p>
         </w:tc>
@@ -19440,7 +19440,7 @@
               <w:rPr>
                 <w:sz w:val="16"/>
               </w:rPr>
-              <w:t>6</w:t>
+              <w:t>3</w:t>
             </w:r>
           </w:p>
         </w:tc>
@@ -19463,7 +19463,7 @@
               <w:rPr>
                 <w:sz w:val="16"/>
               </w:rPr>
-              <w:t>3</w:t>
+              <w:t>2</w:t>
             </w:r>
           </w:p>
         </w:tc>
@@ -19486,7 +19486,7 @@
               <w:rPr>
                 <w:sz w:val="16"/>
               </w:rPr>
-              <w:t>9</w:t>
+              <w:t>5</w:t>
             </w:r>
           </w:p>
         </w:tc>
@@ -19513,7 +19513,7 @@
               <w:rPr>
                 <w:sz w:val="16"/>
               </w:rPr>
-              <w:t>BRPM.012</w:t>
+              <w:t>BRPM.015</w:t>
             </w:r>
           </w:p>
         </w:tc>
@@ -19535,7 +19535,7 @@
               <w:rPr>
                 <w:sz w:val="16"/>
               </w:rPr>
-              <w:t>FR-PM-030</w:t>
+              <w:t>FR-PM-040, FR-PM-041, FR-PM-042, FR-PM-043</w:t>
             </w:r>
           </w:p>
         </w:tc>
@@ -19557,7 +19557,7 @@
               <w:rPr>
                 <w:sz w:val="16"/>
               </w:rPr>
-              <w:t>5</w:t>
+              <w:t>15</w:t>
             </w:r>
           </w:p>
         </w:tc>
@@ -19579,7 +19579,7 @@
               <w:rPr>
                 <w:sz w:val="16"/>
               </w:rPr>
-              <w:t>2</w:t>
+              <w:t>10</w:t>
             </w:r>
           </w:p>
         </w:tc>
@@ -19601,7 +19601,7 @@
               <w:rPr>
                 <w:sz w:val="16"/>
               </w:rPr>
-              <w:t>5</w:t>
+              <w:t>17</w:t>
             </w:r>
           </w:p>
         </w:tc>
@@ -19623,7 +19623,7 @@
               <w:rPr>
                 <w:sz w:val="16"/>
               </w:rPr>
-              <w:t>7</w:t>
+              <w:t>27</w:t>
             </w:r>
           </w:p>
         </w:tc>
@@ -19651,7 +19651,7 @@
               <w:rPr>
                 <w:sz w:val="16"/>
               </w:rPr>
-              <w:t>BRPM.013</w:t>
+              <w:t>BRPM.016</w:t>
             </w:r>
           </w:p>
         </w:tc>
@@ -19674,7 +19674,7 @@
               <w:rPr>
                 <w:sz w:val="16"/>
               </w:rPr>
-              <w:t>FR-PM-031, FR-PM-034, FR-PM-036</w:t>
+              <w:t>FR-PM-044</w:t>
             </w:r>
           </w:p>
         </w:tc>
@@ -19697,7 +19697,7 @@
               <w:rPr>
                 <w:sz w:val="16"/>
               </w:rPr>
-              <w:t>10</w:t>
+              <w:t>4</w:t>
             </w:r>
           </w:p>
         </w:tc>
@@ -19720,7 +19720,7 @@
               <w:rPr>
                 <w:sz w:val="16"/>
               </w:rPr>
-              <w:t>9</w:t>
+              <w:t>2</w:t>
             </w:r>
           </w:p>
         </w:tc>
@@ -19743,7 +19743,7 @@
               <w:rPr>
                 <w:sz w:val="16"/>
               </w:rPr>
-              <w:t>8</w:t>
+              <w:t>5</w:t>
             </w:r>
           </w:p>
         </w:tc>
@@ -19766,7 +19766,7 @@
               <w:rPr>
                 <w:sz w:val="16"/>
               </w:rPr>
-              <w:t>17</w:t>
+              <w:t>7</w:t>
             </w:r>
           </w:p>
         </w:tc>
@@ -19793,7 +19793,7 @@
               <w:rPr>
                 <w:sz w:val="16"/>
               </w:rPr>
-              <w:t>PMADD04</w:t>
+              <w:t>BRPM.017</w:t>
             </w:r>
           </w:p>
         </w:tc>
@@ -19815,7 +19815,7 @@
               <w:rPr>
                 <w:sz w:val="16"/>
               </w:rPr>
-              <w:t>FR-PM-031, FR-PM-032</w:t>
+              <w:t>FR-PM-044, FR-PM-060, FR-PM-061, FR-PM-071</w:t>
             </w:r>
           </w:p>
         </w:tc>
@@ -19837,7 +19837,7 @@
               <w:rPr>
                 <w:sz w:val="16"/>
               </w:rPr>
-              <w:t>7</w:t>
+              <w:t>13</w:t>
             </w:r>
           </w:p>
         </w:tc>
@@ -19859,7 +19859,7 @@
               <w:rPr>
                 <w:sz w:val="16"/>
               </w:rPr>
-              <w:t>6</w:t>
+              <w:t>11</w:t>
             </w:r>
           </w:p>
         </w:tc>
@@ -19881,7 +19881,7 @@
               <w:rPr>
                 <w:sz w:val="16"/>
               </w:rPr>
-              <w:t>5</w:t>
+              <w:t>11</w:t>
             </w:r>
           </w:p>
         </w:tc>
@@ -19903,7 +19903,7 @@
               <w:rPr>
                 <w:sz w:val="16"/>
               </w:rPr>
-              <w:t>11</w:t>
+              <w:t>22</w:t>
             </w:r>
           </w:p>
         </w:tc>
@@ -19931,7 +19931,7 @@
               <w:rPr>
                 <w:sz w:val="16"/>
               </w:rPr>
-              <w:t>BRPM.010</w:t>
+              <w:t>BRPM.018</w:t>
             </w:r>
           </w:p>
         </w:tc>
@@ -19954,7 +19954,7 @@
               <w:rPr>
                 <w:sz w:val="16"/>
               </w:rPr>
-              <w:t>FR-PM-032, FR-PM-033, FR-PM-036</w:t>
+              <w:t>FR-PM-071</w:t>
             </w:r>
           </w:p>
         </w:tc>
@@ -19977,7 +19977,7 @@
               <w:rPr>
                 <w:sz w:val="16"/>
               </w:rPr>
-              <w:t>10</w:t>
+              <w:t>3</w:t>
             </w:r>
           </w:p>
         </w:tc>
@@ -20000,7 +20000,7 @@
               <w:rPr>
                 <w:sz w:val="16"/>
               </w:rPr>
-              <w:t>7</w:t>
+              <w:t>3</w:t>
             </w:r>
           </w:p>
         </w:tc>
@@ -20023,7 +20023,7 @@
               <w:rPr>
                 <w:sz w:val="16"/>
               </w:rPr>
-              <w:t>9</w:t>
+              <w:t>2</w:t>
             </w:r>
           </w:p>
         </w:tc>
@@ -20046,7 +20046,7 @@
               <w:rPr>
                 <w:sz w:val="16"/>
               </w:rPr>
-              <w:t>16</w:t>
+              <w:t>5</w:t>
             </w:r>
           </w:p>
         </w:tc>
@@ -20073,7 +20073,7 @@
               <w:rPr>
                 <w:sz w:val="16"/>
               </w:rPr>
-              <w:t>BRPM.014</w:t>
+              <w:t>BRPM.019</w:t>
             </w:r>
           </w:p>
         </w:tc>
@@ -20095,7 +20095,7 @@
               <w:rPr>
                 <w:sz w:val="16"/>
               </w:rPr>
-              <w:t>FR-PM-034</w:t>
+              <w:t>FR-PM-070</w:t>
             </w:r>
           </w:p>
         </w:tc>
@@ -20117,7 +20117,7 @@
               <w:rPr>
                 <w:sz w:val="16"/>
               </w:rPr>
-              <w:t>4</w:t>
+              <w:t>3</w:t>
             </w:r>
           </w:p>
         </w:tc>
@@ -20211,7 +20211,7 @@
               <w:rPr>
                 <w:sz w:val="16"/>
               </w:rPr>
-              <w:t>PMADD03</w:t>
+              <w:t>BRPM.020</w:t>
             </w:r>
           </w:p>
         </w:tc>
@@ -20234,7 +20234,7 @@
               <w:rPr>
                 <w:sz w:val="16"/>
               </w:rPr>
-              <w:t>FR-PM-035</w:t>
+              <w:t>FR-PM-004</w:t>
             </w:r>
           </w:p>
         </w:tc>
@@ -20303,7 +20303,7 @@
               <w:rPr>
                 <w:sz w:val="16"/>
               </w:rPr>
-              <w:t>3</w:t>
+              <w:t>2</w:t>
             </w:r>
           </w:p>
         </w:tc>
@@ -20326,7 +20326,7 @@
               <w:rPr>
                 <w:sz w:val="16"/>
               </w:rPr>
-              <w:t>5</w:t>
+              <w:t>4</w:t>
             </w:r>
           </w:p>
         </w:tc>
@@ -20353,7 +20353,7 @@
               <w:rPr>
                 <w:sz w:val="16"/>
               </w:rPr>
-              <w:t>BRPM.015</w:t>
+              <w:t>BRPM.021</w:t>
             </w:r>
           </w:p>
         </w:tc>
@@ -20375,7 +20375,7 @@
               <w:rPr>
                 <w:sz w:val="16"/>
               </w:rPr>
-              <w:t>FR-PM-040, FR-PM-041, FR-PM-042, FR-PM-043</w:t>
+              <w:t>FR-PM-021, FR-PM-073</w:t>
             </w:r>
           </w:p>
         </w:tc>
@@ -20397,7 +20397,7 @@
               <w:rPr>
                 <w:sz w:val="16"/>
               </w:rPr>
-              <w:t>15</w:t>
+              <w:t>6</w:t>
             </w:r>
           </w:p>
         </w:tc>
@@ -20419,51 +20419,51 @@
               <w:rPr>
                 <w:sz w:val="16"/>
               </w:rPr>
+              <w:t>4</w:t>
+            </w:r>
+          </w:p>
+        </w:tc>
+        <w:tc>
+          <w:tcPr>
+            <w:tcW w:type="dxa" w:w="928"/>
+            <w:tcMar>
+              <w:top w:w="50" w:type="dxa"/>
+              <w:bottom w:w="50" w:type="dxa"/>
+              <w:left w:w="90" w:type="dxa"/>
+              <w:right w:w="90" w:type="dxa"/>
+            </w:tcMar>
+          </w:tcPr>
+          <w:p>
+            <w:pPr>
+              <w:pStyle w:val="BDOITable"/>
+            </w:pPr>
+            <w:r>
+              <w:rPr>
+                <w:sz w:val="16"/>
+              </w:rPr>
+              <w:t>6</w:t>
+            </w:r>
+          </w:p>
+        </w:tc>
+        <w:tc>
+          <w:tcPr>
+            <w:tcW w:type="dxa" w:w="928"/>
+            <w:tcMar>
+              <w:top w:w="50" w:type="dxa"/>
+              <w:bottom w:w="50" w:type="dxa"/>
+              <w:left w:w="90" w:type="dxa"/>
+              <w:right w:w="90" w:type="dxa"/>
+            </w:tcMar>
+          </w:tcPr>
+          <w:p>
+            <w:pPr>
+              <w:pStyle w:val="BDOITable"/>
+            </w:pPr>
+            <w:r>
+              <w:rPr>
+                <w:sz w:val="16"/>
+              </w:rPr>
               <w:t>10</w:t>
-            </w:r>
-          </w:p>
-        </w:tc>
-        <w:tc>
-          <w:tcPr>
-            <w:tcW w:type="dxa" w:w="928"/>
-            <w:tcMar>
-              <w:top w:w="50" w:type="dxa"/>
-              <w:bottom w:w="50" w:type="dxa"/>
-              <w:left w:w="90" w:type="dxa"/>
-              <w:right w:w="90" w:type="dxa"/>
-            </w:tcMar>
-          </w:tcPr>
-          <w:p>
-            <w:pPr>
-              <w:pStyle w:val="BDOITable"/>
-            </w:pPr>
-            <w:r>
-              <w:rPr>
-                <w:sz w:val="16"/>
-              </w:rPr>
-              <w:t>17</w:t>
-            </w:r>
-          </w:p>
-        </w:tc>
-        <w:tc>
-          <w:tcPr>
-            <w:tcW w:type="dxa" w:w="928"/>
-            <w:tcMar>
-              <w:top w:w="50" w:type="dxa"/>
-              <w:bottom w:w="50" w:type="dxa"/>
-              <w:left w:w="90" w:type="dxa"/>
-              <w:right w:w="90" w:type="dxa"/>
-            </w:tcMar>
-          </w:tcPr>
-          <w:p>
-            <w:pPr>
-              <w:pStyle w:val="BDOITable"/>
-            </w:pPr>
-            <w:r>
-              <w:rPr>
-                <w:sz w:val="16"/>
-              </w:rPr>
-              <w:t>27</w:t>
             </w:r>
           </w:p>
         </w:tc>
@@ -20491,7 +20491,7 @@
               <w:rPr>
                 <w:sz w:val="16"/>
               </w:rPr>
-              <w:t>PMADD06</w:t>
+              <w:t>BRPM.022</w:t>
             </w:r>
           </w:p>
         </w:tc>
@@ -20514,7 +20514,7 @@
               <w:rPr>
                 <w:sz w:val="16"/>
               </w:rPr>
-              <w:t>FR-PM-043</w:t>
+              <w:t>FR-PM-072</w:t>
             </w:r>
           </w:p>
         </w:tc>
@@ -20537,76 +20537,76 @@
               <w:rPr>
                 <w:sz w:val="16"/>
               </w:rPr>
+              <w:t>2</w:t>
+            </w:r>
+          </w:p>
+        </w:tc>
+        <w:tc>
+          <w:tcPr>
+            <w:tcW w:type="dxa" w:w="928"/>
+            <w:tcMar>
+              <w:top w:w="50" w:type="dxa"/>
+              <w:bottom w:w="50" w:type="dxa"/>
+              <w:left w:w="90" w:type="dxa"/>
+              <w:right w:w="90" w:type="dxa"/>
+            </w:tcMar>
+            <w:shd w:val="clear" w:color="auto" w:fill="E5F5FF"/>
+          </w:tcPr>
+          <w:p>
+            <w:pPr>
+              <w:pStyle w:val="BDOITable"/>
+            </w:pPr>
+            <w:r>
+              <w:rPr>
+                <w:sz w:val="16"/>
+              </w:rPr>
+              <w:t>3</w:t>
+            </w:r>
+          </w:p>
+        </w:tc>
+        <w:tc>
+          <w:tcPr>
+            <w:tcW w:type="dxa" w:w="928"/>
+            <w:tcMar>
+              <w:top w:w="50" w:type="dxa"/>
+              <w:bottom w:w="50" w:type="dxa"/>
+              <w:left w:w="90" w:type="dxa"/>
+              <w:right w:w="90" w:type="dxa"/>
+            </w:tcMar>
+            <w:shd w:val="clear" w:color="auto" w:fill="E5F5FF"/>
+          </w:tcPr>
+          <w:p>
+            <w:pPr>
+              <w:pStyle w:val="BDOITable"/>
+            </w:pPr>
+            <w:r>
+              <w:rPr>
+                <w:sz w:val="16"/>
+              </w:rPr>
+              <w:t>1</w:t>
+            </w:r>
+          </w:p>
+        </w:tc>
+        <w:tc>
+          <w:tcPr>
+            <w:tcW w:type="dxa" w:w="928"/>
+            <w:tcMar>
+              <w:top w:w="50" w:type="dxa"/>
+              <w:bottom w:w="50" w:type="dxa"/>
+              <w:left w:w="90" w:type="dxa"/>
+              <w:right w:w="90" w:type="dxa"/>
+            </w:tcMar>
+            <w:shd w:val="clear" w:color="auto" w:fill="E5F5FF"/>
+          </w:tcPr>
+          <w:p>
+            <w:pPr>
+              <w:pStyle w:val="BDOITable"/>
+            </w:pPr>
+            <w:r>
+              <w:rPr>
+                <w:sz w:val="16"/>
+              </w:rPr>
               <w:t>4</w:t>
-            </w:r>
-          </w:p>
-        </w:tc>
-        <w:tc>
-          <w:tcPr>
-            <w:tcW w:type="dxa" w:w="928"/>
-            <w:tcMar>
-              <w:top w:w="50" w:type="dxa"/>
-              <w:bottom w:w="50" w:type="dxa"/>
-              <w:left w:w="90" w:type="dxa"/>
-              <w:right w:w="90" w:type="dxa"/>
-            </w:tcMar>
-            <w:shd w:val="clear" w:color="auto" w:fill="E5F5FF"/>
-          </w:tcPr>
-          <w:p>
-            <w:pPr>
-              <w:pStyle w:val="BDOITable"/>
-            </w:pPr>
-            <w:r>
-              <w:rPr>
-                <w:sz w:val="16"/>
-              </w:rPr>
-              <w:t>3</w:t>
-            </w:r>
-          </w:p>
-        </w:tc>
-        <w:tc>
-          <w:tcPr>
-            <w:tcW w:type="dxa" w:w="928"/>
-            <w:tcMar>
-              <w:top w:w="50" w:type="dxa"/>
-              <w:bottom w:w="50" w:type="dxa"/>
-              <w:left w:w="90" w:type="dxa"/>
-              <w:right w:w="90" w:type="dxa"/>
-            </w:tcMar>
-            <w:shd w:val="clear" w:color="auto" w:fill="E5F5FF"/>
-          </w:tcPr>
-          <w:p>
-            <w:pPr>
-              <w:pStyle w:val="BDOITable"/>
-            </w:pPr>
-            <w:r>
-              <w:rPr>
-                <w:sz w:val="16"/>
-              </w:rPr>
-              <w:t>6</w:t>
-            </w:r>
-          </w:p>
-        </w:tc>
-        <w:tc>
-          <w:tcPr>
-            <w:tcW w:type="dxa" w:w="928"/>
-            <w:tcMar>
-              <w:top w:w="50" w:type="dxa"/>
-              <w:bottom w:w="50" w:type="dxa"/>
-              <w:left w:w="90" w:type="dxa"/>
-              <w:right w:w="90" w:type="dxa"/>
-            </w:tcMar>
-            <w:shd w:val="clear" w:color="auto" w:fill="E5F5FF"/>
-          </w:tcPr>
-          <w:p>
-            <w:pPr>
-              <w:pStyle w:val="BDOITable"/>
-            </w:pPr>
-            <w:r>
-              <w:rPr>
-                <w:sz w:val="16"/>
-              </w:rPr>
-              <w:t>9</w:t>
             </w:r>
           </w:p>
         </w:tc>
@@ -20633,7 +20633,7 @@
               <w:rPr>
                 <w:sz w:val="16"/>
               </w:rPr>
-              <w:t>BRPM.016</w:t>
+              <w:t>BRPM.024</w:t>
             </w:r>
           </w:p>
         </w:tc>
@@ -20655,7 +20655,7 @@
               <w:rPr>
                 <w:sz w:val="16"/>
               </w:rPr>
-              <w:t>FR-PM-044</w:t>
+              <w:t>FR-PM-005</w:t>
             </w:r>
           </w:p>
         </w:tc>
@@ -20677,7 +20677,7 @@
               <w:rPr>
                 <w:sz w:val="16"/>
               </w:rPr>
-              <w:t>4</w:t>
+              <w:t>3</w:t>
             </w:r>
           </w:p>
         </w:tc>
@@ -20721,7 +20721,7 @@
               <w:rPr>
                 <w:sz w:val="16"/>
               </w:rPr>
-              <w:t>5</w:t>
+              <w:t>1</w:t>
             </w:r>
           </w:p>
         </w:tc>
@@ -20743,7 +20743,7 @@
               <w:rPr>
                 <w:sz w:val="16"/>
               </w:rPr>
-              <w:t>7</w:t>
+              <w:t>3</w:t>
             </w:r>
           </w:p>
         </w:tc>
@@ -20771,7 +20771,7 @@
               <w:rPr>
                 <w:sz w:val="16"/>
               </w:rPr>
-              <w:t>BRPM.017</w:t>
+              <w:t>PMADD01</w:t>
             </w:r>
           </w:p>
         </w:tc>
@@ -20794,7 +20794,7 @@
               <w:rPr>
                 <w:sz w:val="16"/>
               </w:rPr>
-              <w:t>FR-PM-044, FR-PM-060, FR-PM-061, FR-PM-071</w:t>
+              <w:t>FR-PM-010</w:t>
             </w:r>
           </w:p>
         </w:tc>
@@ -20817,7 +20817,7 @@
               <w:rPr>
                 <w:sz w:val="16"/>
               </w:rPr>
-              <w:t>13</w:t>
+              <w:t>4</w:t>
             </w:r>
           </w:p>
         </w:tc>
@@ -20840,7 +20840,7 @@
               <w:rPr>
                 <w:sz w:val="16"/>
               </w:rPr>
-              <w:t>11</w:t>
+              <w:t>2</w:t>
             </w:r>
           </w:p>
         </w:tc>
@@ -20863,7 +20863,7 @@
               <w:rPr>
                 <w:sz w:val="16"/>
               </w:rPr>
-              <w:t>11</w:t>
+              <w:t>5</w:t>
             </w:r>
           </w:p>
         </w:tc>
@@ -20886,7 +20886,7 @@
               <w:rPr>
                 <w:sz w:val="16"/>
               </w:rPr>
-              <w:t>22</w:t>
+              <w:t>7</w:t>
             </w:r>
           </w:p>
         </w:tc>
@@ -20913,7 +20913,7 @@
               <w:rPr>
                 <w:sz w:val="16"/>
               </w:rPr>
-              <w:t>BRPM.006</w:t>
+              <w:t>PMADD02</w:t>
             </w:r>
           </w:p>
         </w:tc>
@@ -20935,7 +20935,7 @@
               <w:rPr>
                 <w:sz w:val="16"/>
               </w:rPr>
-              <w:t>FR-PM-045, FR-PM-052, FR-PM-071</w:t>
+              <w:t>FR-PM-011, FR-PM-014</w:t>
             </w:r>
           </w:p>
         </w:tc>
@@ -20957,7 +20957,7 @@
               <w:rPr>
                 <w:sz w:val="16"/>
               </w:rPr>
-              <w:t>9</w:t>
+              <w:t>7</w:t>
             </w:r>
           </w:p>
         </w:tc>
@@ -20979,7 +20979,7 @@
               <w:rPr>
                 <w:sz w:val="16"/>
               </w:rPr>
-              <w:t>7</w:t>
+              <w:t>4</w:t>
             </w:r>
           </w:p>
         </w:tc>
@@ -21001,7 +21001,7 @@
               <w:rPr>
                 <w:sz w:val="16"/>
               </w:rPr>
-              <w:t>7</w:t>
+              <w:t>6</w:t>
             </w:r>
           </w:p>
         </w:tc>
@@ -21023,7 +21023,7 @@
               <w:rPr>
                 <w:sz w:val="16"/>
               </w:rPr>
-              <w:t>14</w:t>
+              <w:t>10</w:t>
             </w:r>
           </w:p>
         </w:tc>
@@ -21051,7 +21051,7 @@
               <w:rPr>
                 <w:sz w:val="16"/>
               </w:rPr>
-              <w:t>BRPM.007</w:t>
+              <w:t>PMADD03</w:t>
             </w:r>
           </w:p>
         </w:tc>
@@ -21074,7 +21074,7 @@
               <w:rPr>
                 <w:sz w:val="16"/>
               </w:rPr>
-              <w:t>FR-PM-050, FR-PM-051</w:t>
+              <w:t>FR-PM-035</w:t>
             </w:r>
           </w:p>
         </w:tc>
@@ -21097,7 +21097,7 @@
               <w:rPr>
                 <w:sz w:val="16"/>
               </w:rPr>
-              <w:t>7</w:t>
+              <w:t>3</w:t>
             </w:r>
           </w:p>
         </w:tc>
@@ -21120,7 +21120,7 @@
               <w:rPr>
                 <w:sz w:val="16"/>
               </w:rPr>
-              <w:t>6</w:t>
+              <w:t>2</w:t>
             </w:r>
           </w:p>
         </w:tc>
@@ -21143,7 +21143,7 @@
               <w:rPr>
                 <w:sz w:val="16"/>
               </w:rPr>
-              <w:t>6</w:t>
+              <w:t>3</w:t>
             </w:r>
           </w:p>
         </w:tc>
@@ -21166,7 +21166,7 @@
               <w:rPr>
                 <w:sz w:val="16"/>
               </w:rPr>
-              <w:t>12</w:t>
+              <w:t>5</w:t>
             </w:r>
           </w:p>
         </w:tc>
@@ -21193,7 +21193,7 @@
               <w:rPr>
                 <w:sz w:val="16"/>
               </w:rPr>
-              <w:t>BRPM.019</w:t>
+              <w:t>PMADD04</w:t>
             </w:r>
           </w:p>
         </w:tc>
@@ -21215,7 +21215,7 @@
               <w:rPr>
                 <w:sz w:val="16"/>
               </w:rPr>
-              <w:t>FR-PM-070</w:t>
+              <w:t>FR-PM-031, FR-PM-032</w:t>
             </w:r>
           </w:p>
         </w:tc>
@@ -21237,7 +21237,7 @@
               <w:rPr>
                 <w:sz w:val="16"/>
               </w:rPr>
-              <w:t>3</w:t>
+              <w:t>7</w:t>
             </w:r>
           </w:p>
         </w:tc>
@@ -21259,7 +21259,7 @@
               <w:rPr>
                 <w:sz w:val="16"/>
               </w:rPr>
-              <w:t>3</w:t>
+              <w:t>6</w:t>
             </w:r>
           </w:p>
         </w:tc>
@@ -21281,7 +21281,7 @@
               <w:rPr>
                 <w:sz w:val="16"/>
               </w:rPr>
-              <w:t>2</w:t>
+              <w:t>5</w:t>
             </w:r>
           </w:p>
         </w:tc>
@@ -21303,7 +21303,7 @@
               <w:rPr>
                 <w:sz w:val="16"/>
               </w:rPr>
-              <w:t>5</w:t>
+              <w:t>11</w:t>
             </w:r>
           </w:p>
         </w:tc>
@@ -21331,7 +21331,7 @@
               <w:rPr>
                 <w:sz w:val="16"/>
               </w:rPr>
-              <w:t>BRPM.018</w:t>
+              <w:t>PMADD05</w:t>
             </w:r>
           </w:p>
         </w:tc>
@@ -21354,7 +21354,7 @@
               <w:rPr>
                 <w:sz w:val="16"/>
               </w:rPr>
-              <w:t>FR-PM-071</w:t>
+              <w:t>FR-PM-002, FR-PM-003</w:t>
             </w:r>
           </w:p>
         </w:tc>
@@ -21377,7 +21377,7 @@
               <w:rPr>
                 <w:sz w:val="16"/>
               </w:rPr>
-              <w:t>3</w:t>
+              <w:t>8</w:t>
             </w:r>
           </w:p>
         </w:tc>
@@ -21400,7 +21400,7 @@
               <w:rPr>
                 <w:sz w:val="16"/>
               </w:rPr>
-              <w:t>3</w:t>
+              <w:t>4</w:t>
             </w:r>
           </w:p>
         </w:tc>
@@ -21423,7 +21423,7 @@
               <w:rPr>
                 <w:sz w:val="16"/>
               </w:rPr>
-              <w:t>2</w:t>
+              <w:t>8</w:t>
             </w:r>
           </w:p>
         </w:tc>
@@ -21446,7 +21446,7 @@
               <w:rPr>
                 <w:sz w:val="16"/>
               </w:rPr>
-              <w:t>5</w:t>
+              <w:t>12</w:t>
             </w:r>
           </w:p>
         </w:tc>
@@ -21473,7 +21473,7 @@
               <w:rPr>
                 <w:sz w:val="16"/>
               </w:rPr>
-              <w:t>BRPM.022</w:t>
+              <w:t>PMADD06</w:t>
             </w:r>
           </w:p>
         </w:tc>
@@ -21495,7 +21495,7 @@
               <w:rPr>
                 <w:sz w:val="16"/>
               </w:rPr>
-              <w:t>FR-PM-072</w:t>
+              <w:t>FR-PM-043</w:t>
             </w:r>
           </w:p>
         </w:tc>
@@ -21517,7 +21517,7 @@
               <w:rPr>
                 <w:sz w:val="16"/>
               </w:rPr>
-              <w:t>2</w:t>
+              <w:t>4</w:t>
             </w:r>
           </w:p>
         </w:tc>
@@ -21561,7 +21561,7 @@
               <w:rPr>
                 <w:sz w:val="16"/>
               </w:rPr>
-              <w:t>1</w:t>
+              <w:t>6</w:t>
             </w:r>
           </w:p>
         </w:tc>
@@ -21583,7 +21583,7 @@
               <w:rPr>
                 <w:sz w:val="16"/>
               </w:rPr>
-              <w:t>4</w:t>
+              <w:t>9</w:t>
             </w:r>
           </w:p>
         </w:tc>
@@ -23150,7 +23150,7 @@
                 <w:color w:val="FFFFFF"/>
                 <w:sz w:val="15"/>
               </w:rPr>
-              <w:t>Auditor</w:t>
+              <w:t>Audit.</w:t>
             </w:r>
           </w:p>
         </w:tc>
@@ -26706,8 +26706,10 @@
         <w:tblLayout w:type="fixed"/>
       </w:tblPr>
       <w:tblGrid>
-        <w:gridCol w:w="7836"/>
-        <w:gridCol w:w="2137"/>
+        <w:gridCol w:w="3936"/>
+        <w:gridCol w:w="1049"/>
+        <w:gridCol w:w="3936"/>
+        <w:gridCol w:w="1049"/>
       </w:tblGrid>
       <w:tr>
         <w:trPr>
@@ -26716,7 +26718,7 @@
         </w:trPr>
         <w:tc>
           <w:tcPr>
-            <w:tcW w:type="dxa" w:w="7835"/>
+            <w:tcW w:type="dxa" w:w="3936"/>
             <w:shd w:val="clear" w:color="auto" w:fill="004EA8"/>
             <w:tcMar>
               <w:top w:w="50" w:type="dxa"/>
@@ -26734,7 +26736,7 @@
               <w:rPr>
                 <w:b/>
                 <w:color w:val="FFFFFF"/>
-                <w:sz w:val="18"/>
+                <w:sz w:val="16"/>
               </w:rPr>
               <w:t>Test class</w:t>
             </w:r>
@@ -26742,7 +26744,7 @@
         </w:tc>
         <w:tc>
           <w:tcPr>
-            <w:tcW w:type="dxa" w:w="2137"/>
+            <w:tcW w:type="dxa" w:w="1050"/>
             <w:shd w:val="clear" w:color="auto" w:fill="004EA8"/>
             <w:tcMar>
               <w:top w:w="50" w:type="dxa"/>
@@ -26760,9 +26762,61 @@
               <w:rPr>
                 <w:b/>
                 <w:color w:val="FFFFFF"/>
-                <w:sz w:val="18"/>
-              </w:rPr>
-              <w:t>Cases referencing it</w:t>
+                <w:sz w:val="16"/>
+              </w:rPr>
+              <w:t>Cases</w:t>
+            </w:r>
+          </w:p>
+        </w:tc>
+        <w:tc>
+          <w:tcPr>
+            <w:tcW w:type="dxa" w:w="3936"/>
+            <w:shd w:val="clear" w:color="auto" w:fill="004EA8"/>
+            <w:tcMar>
+              <w:top w:w="50" w:type="dxa"/>
+              <w:bottom w:w="50" w:type="dxa"/>
+              <w:left w:w="90" w:type="dxa"/>
+              <w:right w:w="90" w:type="dxa"/>
+            </w:tcMar>
+            <w:vAlign w:val="center"/>
+          </w:tcPr>
+          <w:p>
+            <w:pPr>
+              <w:pStyle w:val="BDOITableHeader"/>
+            </w:pPr>
+            <w:r>
+              <w:rPr>
+                <w:b/>
+                <w:color w:val="FFFFFF"/>
+                <w:sz w:val="16"/>
+              </w:rPr>
+              <w:t>Test class</w:t>
+            </w:r>
+          </w:p>
+        </w:tc>
+        <w:tc>
+          <w:tcPr>
+            <w:tcW w:type="dxa" w:w="1050"/>
+            <w:shd w:val="clear" w:color="auto" w:fill="004EA8"/>
+            <w:tcMar>
+              <w:top w:w="50" w:type="dxa"/>
+              <w:bottom w:w="50" w:type="dxa"/>
+              <w:left w:w="90" w:type="dxa"/>
+              <w:right w:w="90" w:type="dxa"/>
+            </w:tcMar>
+            <w:vAlign w:val="center"/>
+          </w:tcPr>
+          <w:p>
+            <w:pPr>
+              <w:pStyle w:val="BDOITableHeader"/>
+            </w:pPr>
+            <w:r>
+              <w:rPr>
+                <w:b/>
+                <w:color w:val="FFFFFF"/>
+                <w:sz w:val="16"/>
+              </w:rPr>
+              <w:t>Cases</w:t>
             </w:r>
           </w:p>
         </w:tc>
@@ -26773,21 +26827,21 @@
         </w:trPr>
         <w:tc>
           <w:tcPr>
-            <w:tcW w:type="dxa" w:w="7835"/>
-            <w:tcMar>
-              <w:top w:w="50" w:type="dxa"/>
-              <w:bottom w:w="50" w:type="dxa"/>
-              <w:left w:w="90" w:type="dxa"/>
-              <w:right w:w="90" w:type="dxa"/>
-            </w:tcMar>
-          </w:tcPr>
-          <w:p>
-            <w:pPr>
-              <w:pStyle w:val="BDOITable"/>
-            </w:pPr>
-            <w:r>
-              <w:rPr>
-                <w:sz w:val="18"/>
+            <w:tcW w:type="dxa" w:w="3936"/>
+            <w:tcMar>
+              <w:top w:w="50" w:type="dxa"/>
+              <w:bottom w:w="50" w:type="dxa"/>
+              <w:left w:w="90" w:type="dxa"/>
+              <w:right w:w="90" w:type="dxa"/>
+            </w:tcMar>
+          </w:tcPr>
+          <w:p>
+            <w:pPr>
+              <w:pStyle w:val="BDOITable"/>
+            </w:pPr>
+            <w:r>
+              <w:rPr>
+                <w:sz w:val="16"/>
               </w:rPr>
               <w:t>PackageRequestProcessIT</w:t>
             </w:r>
@@ -26795,23 +26849,67 @@
         </w:tc>
         <w:tc>
           <w:tcPr>
-            <w:tcW w:type="dxa" w:w="2137"/>
-            <w:tcMar>
-              <w:top w:w="50" w:type="dxa"/>
-              <w:bottom w:w="50" w:type="dxa"/>
-              <w:left w:w="90" w:type="dxa"/>
-              <w:right w:w="90" w:type="dxa"/>
-            </w:tcMar>
-          </w:tcPr>
-          <w:p>
-            <w:pPr>
-              <w:pStyle w:val="BDOITable"/>
-            </w:pPr>
-            <w:r>
-              <w:rPr>
-                <w:sz w:val="18"/>
+            <w:tcW w:type="dxa" w:w="1050"/>
+            <w:tcMar>
+              <w:top w:w="50" w:type="dxa"/>
+              <w:bottom w:w="50" w:type="dxa"/>
+              <w:left w:w="90" w:type="dxa"/>
+              <w:right w:w="90" w:type="dxa"/>
+            </w:tcMar>
+          </w:tcPr>
+          <w:p>
+            <w:pPr>
+              <w:pStyle w:val="BDOITable"/>
+            </w:pPr>
+            <w:r>
+              <w:rPr>
+                <w:sz w:val="16"/>
               </w:rPr>
               <w:t>49</w:t>
+            </w:r>
+          </w:p>
+        </w:tc>
+        <w:tc>
+          <w:tcPr>
+            <w:tcW w:type="dxa" w:w="3936"/>
+            <w:tcMar>
+              <w:top w:w="50" w:type="dxa"/>
+              <w:bottom w:w="50" w:type="dxa"/>
+              <w:left w:w="90" w:type="dxa"/>
+              <w:right w:w="90" w:type="dxa"/>
+            </w:tcMar>
+          </w:tcPr>
+          <w:p>
+            <w:pPr>
+              <w:pStyle w:val="BDOITable"/>
+            </w:pPr>
+            <w:r>
+              <w:rPr>
+                <w:sz w:val="16"/>
+              </w:rPr>
+              <w:t>ProductMaintenanceFoundationIT</w:t>
+            </w:r>
+          </w:p>
+        </w:tc>
+        <w:tc>
+          <w:tcPr>
+            <w:tcW w:type="dxa" w:w="1050"/>
+            <w:tcMar>
+              <w:top w:w="50" w:type="dxa"/>
+              <w:bottom w:w="50" w:type="dxa"/>
+              <w:left w:w="90" w:type="dxa"/>
+              <w:right w:w="90" w:type="dxa"/>
+            </w:tcMar>
+          </w:tcPr>
+          <w:p>
+            <w:pPr>
+              <w:pStyle w:val="BDOITable"/>
+            </w:pPr>
+            <w:r>
+              <w:rPr>
+                <w:sz w:val="16"/>
+              </w:rPr>
+              <w:t>3</w:t>
             </w:r>
           </w:p>
         </w:tc>
@@ -26822,7 +26920,7 @@
         </w:trPr>
         <w:tc>
           <w:tcPr>
-            <w:tcW w:type="dxa" w:w="7835"/>
+            <w:tcW w:type="dxa" w:w="3936"/>
             <w:tcMar>
               <w:top w:w="50" w:type="dxa"/>
               <w:bottom w:w="50" w:type="dxa"/>
@@ -26837,7 +26935,7 @@
             </w:pPr>
             <w:r>
               <w:rPr>
-                <w:sz w:val="18"/>
+                <w:sz w:val="16"/>
               </w:rPr>
               <w:t>CatalogVersionIT</w:t>
             </w:r>
@@ -26845,7 +26943,7 @@
         </w:tc>
         <w:tc>
           <w:tcPr>
-            <w:tcW w:type="dxa" w:w="2137"/>
+            <w:tcW w:type="dxa" w:w="1050"/>
             <w:tcMar>
               <w:top w:w="50" w:type="dxa"/>
               <w:bottom w:w="50" w:type="dxa"/>
@@ -26860,9 +26958,55 @@
             </w:pPr>
             <w:r>
               <w:rPr>
-                <w:sz w:val="18"/>
+                <w:sz w:val="16"/>
               </w:rPr>
               <w:t>16</w:t>
+            </w:r>
+          </w:p>
+        </w:tc>
+        <w:tc>
+          <w:tcPr>
+            <w:tcW w:type="dxa" w:w="3936"/>
+            <w:tcMar>
+              <w:top w:w="50" w:type="dxa"/>
+              <w:bottom w:w="50" w:type="dxa"/>
+              <w:left w:w="90" w:type="dxa"/>
+              <w:right w:w="90" w:type="dxa"/>
+            </w:tcMar>
+            <w:shd w:val="clear" w:color="auto" w:fill="E5F5FF"/>
+          </w:tcPr>
+          <w:p>
+            <w:pPr>
+              <w:pStyle w:val="BDOITable"/>
+            </w:pPr>
+            <w:r>
+              <w:rPr>
+                <w:sz w:val="16"/>
+              </w:rPr>
+              <w:t>productMaintenanceForms.test.ts</w:t>
+            </w:r>
+          </w:p>
+        </w:tc>
+        <w:tc>
+          <w:tcPr>
+            <w:tcW w:type="dxa" w:w="1050"/>
+            <w:tcMar>
+              <w:top w:w="50" w:type="dxa"/>
+              <w:bottom w:w="50" w:type="dxa"/>
+              <w:left w:w="90" w:type="dxa"/>
+              <w:right w:w="90" w:type="dxa"/>
+            </w:tcMar>
+            <w:shd w:val="clear" w:color="auto" w:fill="E5F5FF"/>
+          </w:tcPr>
+          <w:p>
+            <w:pPr>
+              <w:pStyle w:val="BDOITable"/>
+            </w:pPr>
+            <w:r>
+              <w:rPr>
+                <w:sz w:val="16"/>
+              </w:rPr>
+              <w:t>3</w:t>
             </w:r>
           </w:p>
         </w:tc>
@@ -26873,21 +27017,21 @@
         </w:trPr>
         <w:tc>
           <w:tcPr>
-            <w:tcW w:type="dxa" w:w="7835"/>
-            <w:tcMar>
-              <w:top w:w="50" w:type="dxa"/>
-              <w:bottom w:w="50" w:type="dxa"/>
-              <w:left w:w="90" w:type="dxa"/>
-              <w:right w:w="90" w:type="dxa"/>
-            </w:tcMar>
-          </w:tcPr>
-          <w:p>
-            <w:pPr>
-              <w:pStyle w:val="BDOITable"/>
-            </w:pPr>
-            <w:r>
-              <w:rPr>
-                <w:sz w:val="18"/>
+            <w:tcW w:type="dxa" w:w="3936"/>
+            <w:tcMar>
+              <w:top w:w="50" w:type="dxa"/>
+              <w:bottom w:w="50" w:type="dxa"/>
+              <w:left w:w="90" w:type="dxa"/>
+              <w:right w:w="90" w:type="dxa"/>
+            </w:tcMar>
+          </w:tcPr>
+          <w:p>
+            <w:pPr>
+              <w:pStyle w:val="BDOITable"/>
+            </w:pPr>
+            <w:r>
+              <w:rPr>
+                <w:sz w:val="16"/>
               </w:rPr>
               <w:t>ProductMaintenanceApiIT</w:t>
             </w:r>
@@ -26895,23 +27039,67 @@
         </w:tc>
         <w:tc>
           <w:tcPr>
-            <w:tcW w:type="dxa" w:w="2137"/>
-            <w:tcMar>
-              <w:top w:w="50" w:type="dxa"/>
-              <w:bottom w:w="50" w:type="dxa"/>
-              <w:left w:w="90" w:type="dxa"/>
-              <w:right w:w="90" w:type="dxa"/>
-            </w:tcMar>
-          </w:tcPr>
-          <w:p>
-            <w:pPr>
-              <w:pStyle w:val="BDOITable"/>
-            </w:pPr>
-            <w:r>
-              <w:rPr>
-                <w:sz w:val="18"/>
+            <w:tcW w:type="dxa" w:w="1050"/>
+            <w:tcMar>
+              <w:top w:w="50" w:type="dxa"/>
+              <w:bottom w:w="50" w:type="dxa"/>
+              <w:left w:w="90" w:type="dxa"/>
+              <w:right w:w="90" w:type="dxa"/>
+            </w:tcMar>
+          </w:tcPr>
+          <w:p>
+            <w:pPr>
+              <w:pStyle w:val="BDOITable"/>
+            </w:pPr>
+            <w:r>
+              <w:rPr>
+                <w:sz w:val="16"/>
               </w:rPr>
               <w:t>15</w:t>
+            </w:r>
+          </w:p>
+        </w:tc>
+        <w:tc>
+          <w:tcPr>
+            <w:tcW w:type="dxa" w:w="3936"/>
+            <w:tcMar>
+              <w:top w:w="50" w:type="dxa"/>
+              <w:bottom w:w="50" w:type="dxa"/>
+              <w:left w:w="90" w:type="dxa"/>
+              <w:right w:w="90" w:type="dxa"/>
+            </w:tcMar>
+          </w:tcPr>
+          <w:p>
+            <w:pPr>
+              <w:pStyle w:val="BDOITable"/>
+            </w:pPr>
+            <w:r>
+              <w:rPr>
+                <w:sz w:val="16"/>
+              </w:rPr>
+              <w:t>AccessRequestIT</w:t>
+            </w:r>
+          </w:p>
+        </w:tc>
+        <w:tc>
+          <w:tcPr>
+            <w:tcW w:type="dxa" w:w="1050"/>
+            <w:tcMar>
+              <w:top w:w="50" w:type="dxa"/>
+              <w:bottom w:w="50" w:type="dxa"/>
+              <w:left w:w="90" w:type="dxa"/>
+              <w:right w:w="90" w:type="dxa"/>
+            </w:tcMar>
+          </w:tcPr>
+          <w:p>
+            <w:pPr>
+              <w:pStyle w:val="BDOITable"/>
+            </w:pPr>
+            <w:r>
+              <w:rPr>
+                <w:sz w:val="16"/>
+              </w:rPr>
+              <w:t>2</w:t>
             </w:r>
           </w:p>
         </w:tc>
@@ -26922,7 +27110,7 @@
         </w:trPr>
         <w:tc>
           <w:tcPr>
-            <w:tcW w:type="dxa" w:w="7835"/>
+            <w:tcW w:type="dxa" w:w="3936"/>
             <w:tcMar>
               <w:top w:w="50" w:type="dxa"/>
               <w:bottom w:w="50" w:type="dxa"/>
@@ -26937,7 +27125,7 @@
             </w:pPr>
             <w:r>
               <w:rPr>
-                <w:sz w:val="18"/>
+                <w:sz w:val="16"/>
               </w:rPr>
               <w:t>CatalogProductMaintenanceApiIT</w:t>
             </w:r>
@@ -26945,7 +27133,7 @@
         </w:tc>
         <w:tc>
           <w:tcPr>
-            <w:tcW w:type="dxa" w:w="2137"/>
+            <w:tcW w:type="dxa" w:w="1050"/>
             <w:tcMar>
               <w:top w:w="50" w:type="dxa"/>
               <w:bottom w:w="50" w:type="dxa"/>
@@ -26960,9 +27148,55 @@
             </w:pPr>
             <w:r>
               <w:rPr>
-                <w:sz w:val="18"/>
+                <w:sz w:val="16"/>
               </w:rPr>
               <w:t>10</w:t>
+            </w:r>
+          </w:p>
+        </w:tc>
+        <w:tc>
+          <w:tcPr>
+            <w:tcW w:type="dxa" w:w="3936"/>
+            <w:tcMar>
+              <w:top w:w="50" w:type="dxa"/>
+              <w:bottom w:w="50" w:type="dxa"/>
+              <w:left w:w="90" w:type="dxa"/>
+              <w:right w:w="90" w:type="dxa"/>
+            </w:tcMar>
+            <w:shd w:val="clear" w:color="auto" w:fill="E5F5FF"/>
+          </w:tcPr>
+          <w:p>
+            <w:pPr>
+              <w:pStyle w:val="BDOITable"/>
+            </w:pPr>
+            <w:r>
+              <w:rPr>
+                <w:sz w:val="16"/>
+              </w:rPr>
+              <w:t>ApiSmokeIT</w:t>
+            </w:r>
+          </w:p>
+        </w:tc>
+        <w:tc>
+          <w:tcPr>
+            <w:tcW w:type="dxa" w:w="1050"/>
+            <w:tcMar>
+              <w:top w:w="50" w:type="dxa"/>
+              <w:bottom w:w="50" w:type="dxa"/>
+              <w:left w:w="90" w:type="dxa"/>
+              <w:right w:w="90" w:type="dxa"/>
+            </w:tcMar>
+            <w:shd w:val="clear" w:color="auto" w:fill="E5F5FF"/>
+          </w:tcPr>
+          <w:p>
+            <w:pPr>
+              <w:pStyle w:val="BDOITable"/>
+            </w:pPr>
+            <w:r>
+              <w:rPr>
+                <w:sz w:val="16"/>
+              </w:rPr>
+              <w:t>2</w:t>
             </w:r>
           </w:p>
         </w:tc>
@@ -26973,21 +27207,21 @@
         </w:trPr>
         <w:tc>
           <w:tcPr>
-            <w:tcW w:type="dxa" w:w="7835"/>
-            <w:tcMar>
-              <w:top w:w="50" w:type="dxa"/>
-              <w:bottom w:w="50" w:type="dxa"/>
-              <w:left w:w="90" w:type="dxa"/>
-              <w:right w:w="90" w:type="dxa"/>
-            </w:tcMar>
-          </w:tcPr>
-          <w:p>
-            <w:pPr>
-              <w:pStyle w:val="BDOITable"/>
-            </w:pPr>
-            <w:r>
-              <w:rPr>
-                <w:sz w:val="18"/>
+            <w:tcW w:type="dxa" w:w="3936"/>
+            <w:tcMar>
+              <w:top w:w="50" w:type="dxa"/>
+              <w:bottom w:w="50" w:type="dxa"/>
+              <w:left w:w="90" w:type="dxa"/>
+              <w:right w:w="90" w:type="dxa"/>
+            </w:tcMar>
+          </w:tcPr>
+          <w:p>
+            <w:pPr>
+              <w:pStyle w:val="BDOITable"/>
+            </w:pPr>
+            <w:r>
+              <w:rPr>
+                <w:sz w:val="16"/>
               </w:rPr>
               <w:t>IncentiveCriteriaIT</w:t>
             </w:r>
@@ -26995,23 +27229,67 @@
         </w:tc>
         <w:tc>
           <w:tcPr>
-            <w:tcW w:type="dxa" w:w="2137"/>
-            <w:tcMar>
-              <w:top w:w="50" w:type="dxa"/>
-              <w:bottom w:w="50" w:type="dxa"/>
-              <w:left w:w="90" w:type="dxa"/>
-              <w:right w:w="90" w:type="dxa"/>
-            </w:tcMar>
-          </w:tcPr>
-          <w:p>
-            <w:pPr>
-              <w:pStyle w:val="BDOITable"/>
-            </w:pPr>
-            <w:r>
-              <w:rPr>
-                <w:sz w:val="18"/>
+            <w:tcW w:type="dxa" w:w="1050"/>
+            <w:tcMar>
+              <w:top w:w="50" w:type="dxa"/>
+              <w:bottom w:w="50" w:type="dxa"/>
+              <w:left w:w="90" w:type="dxa"/>
+              <w:right w:w="90" w:type="dxa"/>
+            </w:tcMar>
+          </w:tcPr>
+          <w:p>
+            <w:pPr>
+              <w:pStyle w:val="BDOITable"/>
+            </w:pPr>
+            <w:r>
+              <w:rPr>
+                <w:sz w:val="16"/>
               </w:rPr>
               <w:t>9</w:t>
+            </w:r>
+          </w:p>
+        </w:tc>
+        <w:tc>
+          <w:tcPr>
+            <w:tcW w:type="dxa" w:w="3936"/>
+            <w:tcMar>
+              <w:top w:w="50" w:type="dxa"/>
+              <w:bottom w:w="50" w:type="dxa"/>
+              <w:left w:w="90" w:type="dxa"/>
+              <w:right w:w="90" w:type="dxa"/>
+            </w:tcMar>
+          </w:tcPr>
+          <w:p>
+            <w:pPr>
+              <w:pStyle w:val="BDOITable"/>
+            </w:pPr>
+            <w:r>
+              <w:rPr>
+                <w:sz w:val="16"/>
+              </w:rPr>
+              <w:t>LoginLockoutTest</w:t>
+            </w:r>
+          </w:p>
+        </w:tc>
+        <w:tc>
+          <w:tcPr>
+            <w:tcW w:type="dxa" w:w="1050"/>
+            <w:tcMar>
+              <w:top w:w="50" w:type="dxa"/>
+              <w:bottom w:w="50" w:type="dxa"/>
+              <w:left w:w="90" w:type="dxa"/>
+              <w:right w:w="90" w:type="dxa"/>
+            </w:tcMar>
+          </w:tcPr>
+          <w:p>
+            <w:pPr>
+              <w:pStyle w:val="BDOITable"/>
+            </w:pPr>
+            <w:r>
+              <w:rPr>
+                <w:sz w:val="16"/>
+              </w:rPr>
+              <w:t>2</w:t>
             </w:r>
           </w:p>
         </w:tc>
@@ -27022,7 +27300,7 @@
         </w:trPr>
         <w:tc>
           <w:tcPr>
-            <w:tcW w:type="dxa" w:w="7835"/>
+            <w:tcW w:type="dxa" w:w="3936"/>
             <w:tcMar>
               <w:top w:w="50" w:type="dxa"/>
               <w:bottom w:w="50" w:type="dxa"/>
@@ -27037,7 +27315,7 @@
             </w:pPr>
             <w:r>
               <w:rPr>
-                <w:sz w:val="18"/>
+                <w:sz w:val="16"/>
               </w:rPr>
               <w:t>RatingSchemeIT</w:t>
             </w:r>
@@ -27045,7 +27323,7 @@
         </w:tc>
         <w:tc>
           <w:tcPr>
-            <w:tcW w:type="dxa" w:w="2137"/>
+            <w:tcW w:type="dxa" w:w="1050"/>
             <w:tcMar>
               <w:top w:w="50" w:type="dxa"/>
               <w:bottom w:w="50" w:type="dxa"/>
@@ -27060,9 +27338,55 @@
             </w:pPr>
             <w:r>
               <w:rPr>
-                <w:sz w:val="18"/>
+                <w:sz w:val="16"/>
               </w:rPr>
               <w:t>7</w:t>
+            </w:r>
+          </w:p>
+        </w:tc>
+        <w:tc>
+          <w:tcPr>
+            <w:tcW w:type="dxa" w:w="3936"/>
+            <w:tcMar>
+              <w:top w:w="50" w:type="dxa"/>
+              <w:bottom w:w="50" w:type="dxa"/>
+              <w:left w:w="90" w:type="dxa"/>
+              <w:right w:w="90" w:type="dxa"/>
+            </w:tcMar>
+            <w:shd w:val="clear" w:color="auto" w:fill="E5F5FF"/>
+          </w:tcPr>
+          <w:p>
+            <w:pPr>
+              <w:pStyle w:val="BDOITable"/>
+            </w:pPr>
+            <w:r>
+              <w:rPr>
+                <w:sz w:val="16"/>
+              </w:rPr>
+              <w:t>AuditTrailImmutabilityIT</w:t>
+            </w:r>
+          </w:p>
+        </w:tc>
+        <w:tc>
+          <w:tcPr>
+            <w:tcW w:type="dxa" w:w="1050"/>
+            <w:tcMar>
+              <w:top w:w="50" w:type="dxa"/>
+              <w:bottom w:w="50" w:type="dxa"/>
+              <w:left w:w="90" w:type="dxa"/>
+              <w:right w:w="90" w:type="dxa"/>
+            </w:tcMar>
+            <w:shd w:val="clear" w:color="auto" w:fill="E5F5FF"/>
+          </w:tcPr>
+          <w:p>
+            <w:pPr>
+              <w:pStyle w:val="BDOITable"/>
+            </w:pPr>
+            <w:r>
+              <w:rPr>
+                <w:sz w:val="16"/>
+              </w:rPr>
+              <w:t>1</w:t>
             </w:r>
           </w:p>
         </w:tc>
@@ -27073,21 +27397,21 @@
         </w:trPr>
         <w:tc>
           <w:tcPr>
-            <w:tcW w:type="dxa" w:w="7835"/>
-            <w:tcMar>
-              <w:top w:w="50" w:type="dxa"/>
-              <w:bottom w:w="50" w:type="dxa"/>
-              <w:left w:w="90" w:type="dxa"/>
-              <w:right w:w="90" w:type="dxa"/>
-            </w:tcMar>
-          </w:tcPr>
-          <w:p>
-            <w:pPr>
-              <w:pStyle w:val="BDOITable"/>
-            </w:pPr>
-            <w:r>
-              <w:rPr>
-                <w:sz w:val="18"/>
+            <w:tcW w:type="dxa" w:w="3936"/>
+            <w:tcMar>
+              <w:top w:w="50" w:type="dxa"/>
+              <w:bottom w:w="50" w:type="dxa"/>
+              <w:left w:w="90" w:type="dxa"/>
+              <w:right w:w="90" w:type="dxa"/>
+            </w:tcMar>
+          </w:tcPr>
+          <w:p>
+            <w:pPr>
+              <w:pStyle w:val="BDOITable"/>
+            </w:pPr>
+            <w:r>
+              <w:rPr>
+                <w:sz w:val="16"/>
               </w:rPr>
               <w:t>packageRequest.test.ts</w:t>
             </w:r>
@@ -27095,23 +27419,67 @@
         </w:tc>
         <w:tc>
           <w:tcPr>
-            <w:tcW w:type="dxa" w:w="2137"/>
-            <w:tcMar>
-              <w:top w:w="50" w:type="dxa"/>
-              <w:bottom w:w="50" w:type="dxa"/>
-              <w:left w:w="90" w:type="dxa"/>
-              <w:right w:w="90" w:type="dxa"/>
-            </w:tcMar>
-          </w:tcPr>
-          <w:p>
-            <w:pPr>
-              <w:pStyle w:val="BDOITable"/>
-            </w:pPr>
-            <w:r>
-              <w:rPr>
-                <w:sz w:val="18"/>
+            <w:tcW w:type="dxa" w:w="1050"/>
+            <w:tcMar>
+              <w:top w:w="50" w:type="dxa"/>
+              <w:bottom w:w="50" w:type="dxa"/>
+              <w:left w:w="90" w:type="dxa"/>
+              <w:right w:w="90" w:type="dxa"/>
+            </w:tcMar>
+          </w:tcPr>
+          <w:p>
+            <w:pPr>
+              <w:pStyle w:val="BDOITable"/>
+            </w:pPr>
+            <w:r>
+              <w:rPr>
+                <w:sz w:val="16"/>
               </w:rPr>
               <w:t>7</w:t>
+            </w:r>
+          </w:p>
+        </w:tc>
+        <w:tc>
+          <w:tcPr>
+            <w:tcW w:type="dxa" w:w="3936"/>
+            <w:tcMar>
+              <w:top w:w="50" w:type="dxa"/>
+              <w:bottom w:w="50" w:type="dxa"/>
+              <w:left w:w="90" w:type="dxa"/>
+              <w:right w:w="90" w:type="dxa"/>
+            </w:tcMar>
+          </w:tcPr>
+          <w:p>
+            <w:pPr>
+              <w:pStyle w:val="BDOITable"/>
+            </w:pPr>
+            <w:r>
+              <w:rPr>
+                <w:sz w:val="16"/>
+              </w:rPr>
+              <w:t>DocTemplateServiceIT</w:t>
+            </w:r>
+          </w:p>
+        </w:tc>
+        <w:tc>
+          <w:tcPr>
+            <w:tcW w:type="dxa" w:w="1050"/>
+            <w:tcMar>
+              <w:top w:w="50" w:type="dxa"/>
+              <w:bottom w:w="50" w:type="dxa"/>
+              <w:left w:w="90" w:type="dxa"/>
+              <w:right w:w="90" w:type="dxa"/>
+            </w:tcMar>
+          </w:tcPr>
+          <w:p>
+            <w:pPr>
+              <w:pStyle w:val="BDOITable"/>
+            </w:pPr>
+            <w:r>
+              <w:rPr>
+                <w:sz w:val="16"/>
+              </w:rPr>
+              <w:t>1</w:t>
             </w:r>
           </w:p>
         </w:tc>
@@ -27122,7 +27490,7 @@
         </w:trPr>
         <w:tc>
           <w:tcPr>
-            <w:tcW w:type="dxa" w:w="7835"/>
+            <w:tcW w:type="dxa" w:w="3936"/>
             <w:tcMar>
               <w:top w:w="50" w:type="dxa"/>
               <w:bottom w:w="50" w:type="dxa"/>
@@ -27137,7 +27505,7 @@
             </w:pPr>
             <w:r>
               <w:rPr>
-                <w:sz w:val="18"/>
+                <w:sz w:val="16"/>
               </w:rPr>
               <w:t>PackageExpiryIT</w:t>
             </w:r>
@@ -27145,7 +27513,7 @@
         </w:tc>
         <w:tc>
           <w:tcPr>
-            <w:tcW w:type="dxa" w:w="2137"/>
+            <w:tcW w:type="dxa" w:w="1050"/>
             <w:tcMar>
               <w:top w:w="50" w:type="dxa"/>
               <w:bottom w:w="50" w:type="dxa"/>
@@ -27160,9 +27528,55 @@
             </w:pPr>
             <w:r>
               <w:rPr>
-                <w:sz w:val="18"/>
+                <w:sz w:val="16"/>
               </w:rPr>
               <w:t>6</w:t>
+            </w:r>
+          </w:p>
+        </w:tc>
+        <w:tc>
+          <w:tcPr>
+            <w:tcW w:type="dxa" w:w="3936"/>
+            <w:tcMar>
+              <w:top w:w="50" w:type="dxa"/>
+              <w:bottom w:w="50" w:type="dxa"/>
+              <w:left w:w="90" w:type="dxa"/>
+              <w:right w:w="90" w:type="dxa"/>
+            </w:tcMar>
+            <w:shd w:val="clear" w:color="auto" w:fill="E5F5FF"/>
+          </w:tcPr>
+          <w:p>
+            <w:pPr>
+              <w:pStyle w:val="BDOITable"/>
+            </w:pPr>
+            <w:r>
+              <w:rPr>
+                <w:sz w:val="16"/>
+              </w:rPr>
+              <w:t>LogoutIT</w:t>
+            </w:r>
+          </w:p>
+        </w:tc>
+        <w:tc>
+          <w:tcPr>
+            <w:tcW w:type="dxa" w:w="1050"/>
+            <w:tcMar>
+              <w:top w:w="50" w:type="dxa"/>
+              <w:bottom w:w="50" w:type="dxa"/>
+              <w:left w:w="90" w:type="dxa"/>
+              <w:right w:w="90" w:type="dxa"/>
+            </w:tcMar>
+            <w:shd w:val="clear" w:color="auto" w:fill="E5F5FF"/>
+          </w:tcPr>
+          <w:p>
+            <w:pPr>
+              <w:pStyle w:val="BDOITable"/>
+            </w:pPr>
+            <w:r>
+              <w:rPr>
+                <w:sz w:val="16"/>
+              </w:rPr>
+              <w:t>1</w:t>
             </w:r>
           </w:p>
         </w:tc>
@@ -27173,21 +27587,21 @@
         </w:trPr>
         <w:tc>
           <w:tcPr>
-            <w:tcW w:type="dxa" w:w="7835"/>
-            <w:tcMar>
-              <w:top w:w="50" w:type="dxa"/>
-              <w:bottom w:w="50" w:type="dxa"/>
-              <w:left w:w="90" w:type="dxa"/>
-              <w:right w:w="90" w:type="dxa"/>
-            </w:tcMar>
-          </w:tcPr>
-          <w:p>
-            <w:pPr>
-              <w:pStyle w:val="BDOITable"/>
-            </w:pPr>
-            <w:r>
-              <w:rPr>
-                <w:sz w:val="18"/>
+            <w:tcW w:type="dxa" w:w="3936"/>
+            <w:tcMar>
+              <w:top w:w="50" w:type="dxa"/>
+              <w:bottom w:w="50" w:type="dxa"/>
+              <w:left w:w="90" w:type="dxa"/>
+              <w:right w:w="90" w:type="dxa"/>
+            </w:tcMar>
+          </w:tcPr>
+          <w:p>
+            <w:pPr>
+              <w:pStyle w:val="BDOITable"/>
+            </w:pPr>
+            <w:r>
+              <w:rPr>
+                <w:sz w:val="16"/>
               </w:rPr>
               <w:t>CatalogIT</w:t>
             </w:r>
@@ -27195,23 +27609,67 @@
         </w:tc>
         <w:tc>
           <w:tcPr>
-            <w:tcW w:type="dxa" w:w="2137"/>
-            <w:tcMar>
-              <w:top w:w="50" w:type="dxa"/>
-              <w:bottom w:w="50" w:type="dxa"/>
-              <w:left w:w="90" w:type="dxa"/>
-              <w:right w:w="90" w:type="dxa"/>
-            </w:tcMar>
-          </w:tcPr>
-          <w:p>
-            <w:pPr>
-              <w:pStyle w:val="BDOITable"/>
-            </w:pPr>
-            <w:r>
-              <w:rPr>
-                <w:sz w:val="18"/>
+            <w:tcW w:type="dxa" w:w="1050"/>
+            <w:tcMar>
+              <w:top w:w="50" w:type="dxa"/>
+              <w:bottom w:w="50" w:type="dxa"/>
+              <w:left w:w="90" w:type="dxa"/>
+              <w:right w:w="90" w:type="dxa"/>
+            </w:tcMar>
+          </w:tcPr>
+          <w:p>
+            <w:pPr>
+              <w:pStyle w:val="BDOITable"/>
+            </w:pPr>
+            <w:r>
+              <w:rPr>
+                <w:sz w:val="16"/>
               </w:rPr>
               <w:t>5</w:t>
+            </w:r>
+          </w:p>
+        </w:tc>
+        <w:tc>
+          <w:tcPr>
+            <w:tcW w:type="dxa" w:w="3936"/>
+            <w:tcMar>
+              <w:top w:w="50" w:type="dxa"/>
+              <w:bottom w:w="50" w:type="dxa"/>
+              <w:left w:w="90" w:type="dxa"/>
+              <w:right w:w="90" w:type="dxa"/>
+            </w:tcMar>
+          </w:tcPr>
+          <w:p>
+            <w:pPr>
+              <w:pStyle w:val="BDOITable"/>
+            </w:pPr>
+            <w:r>
+              <w:rPr>
+                <w:sz w:val="16"/>
+              </w:rPr>
+              <w:t>NbReportApiIT</w:t>
+            </w:r>
+          </w:p>
+        </w:tc>
+        <w:tc>
+          <w:tcPr>
+            <w:tcW w:type="dxa" w:w="1050"/>
+            <w:tcMar>
+              <w:top w:w="50" w:type="dxa"/>
+              <w:bottom w:w="50" w:type="dxa"/>
+              <w:left w:w="90" w:type="dxa"/>
+              <w:right w:w="90" w:type="dxa"/>
+            </w:tcMar>
+          </w:tcPr>
+          <w:p>
+            <w:pPr>
+              <w:pStyle w:val="BDOITable"/>
+            </w:pPr>
+            <w:r>
+              <w:rPr>
+                <w:sz w:val="16"/>
+              </w:rPr>
+              <w:t>1</w:t>
             </w:r>
           </w:p>
         </w:tc>
@@ -27222,7 +27680,7 @@
         </w:trPr>
         <w:tc>
           <w:tcPr>
-            <w:tcW w:type="dxa" w:w="7835"/>
+            <w:tcW w:type="dxa" w:w="3936"/>
             <w:tcMar>
               <w:top w:w="50" w:type="dxa"/>
               <w:bottom w:w="50" w:type="dxa"/>
@@ -27237,7 +27695,7 @@
             </w:pPr>
             <w:r>
               <w:rPr>
-                <w:sz w:val="18"/>
+                <w:sz w:val="16"/>
               </w:rPr>
               <w:t>PackageLogicTest</w:t>
             </w:r>
@@ -27245,7 +27703,7 @@
         </w:tc>
         <w:tc>
           <w:tcPr>
-            <w:tcW w:type="dxa" w:w="2137"/>
+            <w:tcW w:type="dxa" w:w="1050"/>
             <w:tcMar>
               <w:top w:w="50" w:type="dxa"/>
               <w:bottom w:w="50" w:type="dxa"/>
@@ -27260,9 +27718,55 @@
             </w:pPr>
             <w:r>
               <w:rPr>
-                <w:sz w:val="18"/>
+                <w:sz w:val="16"/>
               </w:rPr>
               <w:t>5</w:t>
+            </w:r>
+          </w:p>
+        </w:tc>
+        <w:tc>
+          <w:tcPr>
+            <w:tcW w:type="dxa" w:w="3936"/>
+            <w:tcMar>
+              <w:top w:w="50" w:type="dxa"/>
+              <w:bottom w:w="50" w:type="dxa"/>
+              <w:left w:w="90" w:type="dxa"/>
+              <w:right w:w="90" w:type="dxa"/>
+            </w:tcMar>
+            <w:shd w:val="clear" w:color="auto" w:fill="E5F5FF"/>
+          </w:tcPr>
+          <w:p>
+            <w:pPr>
+              <w:pStyle w:val="BDOITable"/>
+            </w:pPr>
+            <w:r>
+              <w:rPr>
+                <w:sz w:val="16"/>
+              </w:rPr>
+              <w:t>OperationsFoundationApiIT</w:t>
+            </w:r>
+          </w:p>
+        </w:tc>
+        <w:tc>
+          <w:tcPr>
+            <w:tcW w:type="dxa" w:w="1050"/>
+            <w:tcMar>
+              <w:top w:w="50" w:type="dxa"/>
+              <w:bottom w:w="50" w:type="dxa"/>
+              <w:left w:w="90" w:type="dxa"/>
+              <w:right w:w="90" w:type="dxa"/>
+            </w:tcMar>
+            <w:shd w:val="clear" w:color="auto" w:fill="E5F5FF"/>
+          </w:tcPr>
+          <w:p>
+            <w:pPr>
+              <w:pStyle w:val="BDOITable"/>
+            </w:pPr>
+            <w:r>
+              <w:rPr>
+                <w:sz w:val="16"/>
+              </w:rPr>
+              <w:t>1</w:t>
             </w:r>
           </w:p>
         </w:tc>
@@ -27273,21 +27777,21 @@
         </w:trPr>
         <w:tc>
           <w:tcPr>
-            <w:tcW w:type="dxa" w:w="7835"/>
-            <w:tcMar>
-              <w:top w:w="50" w:type="dxa"/>
-              <w:bottom w:w="50" w:type="dxa"/>
-              <w:left w:w="90" w:type="dxa"/>
-              <w:right w:w="90" w:type="dxa"/>
-            </w:tcMar>
-          </w:tcPr>
-          <w:p>
-            <w:pPr>
-              <w:pStyle w:val="BDOITable"/>
-            </w:pPr>
-            <w:r>
-              <w:rPr>
-                <w:sz w:val="18"/>
+            <w:tcW w:type="dxa" w:w="3936"/>
+            <w:tcMar>
+              <w:top w:w="50" w:type="dxa"/>
+              <w:bottom w:w="50" w:type="dxa"/>
+              <w:left w:w="90" w:type="dxa"/>
+              <w:right w:w="90" w:type="dxa"/>
+            </w:tcMar>
+          </w:tcPr>
+          <w:p>
+            <w:pPr>
+              <w:pStyle w:val="BDOITable"/>
+            </w:pPr>
+            <w:r>
+              <w:rPr>
+                <w:sz w:val="16"/>
               </w:rPr>
               <w:t>RolePermissionRequestIT</w:t>
             </w:r>
@@ -27295,23 +27799,67 @@
         </w:tc>
         <w:tc>
           <w:tcPr>
-            <w:tcW w:type="dxa" w:w="2137"/>
-            <w:tcMar>
-              <w:top w:w="50" w:type="dxa"/>
-              <w:bottom w:w="50" w:type="dxa"/>
-              <w:left w:w="90" w:type="dxa"/>
-              <w:right w:w="90" w:type="dxa"/>
-            </w:tcMar>
-          </w:tcPr>
-          <w:p>
-            <w:pPr>
-              <w:pStyle w:val="BDOITable"/>
-            </w:pPr>
-            <w:r>
-              <w:rPr>
-                <w:sz w:val="18"/>
+            <w:tcW w:type="dxa" w:w="1050"/>
+            <w:tcMar>
+              <w:top w:w="50" w:type="dxa"/>
+              <w:bottom w:w="50" w:type="dxa"/>
+              <w:left w:w="90" w:type="dxa"/>
+              <w:right w:w="90" w:type="dxa"/>
+            </w:tcMar>
+          </w:tcPr>
+          <w:p>
+            <w:pPr>
+              <w:pStyle w:val="BDOITable"/>
+            </w:pPr>
+            <w:r>
+              <w:rPr>
+                <w:sz w:val="16"/>
               </w:rPr>
               <w:t>5</w:t>
+            </w:r>
+          </w:p>
+        </w:tc>
+        <w:tc>
+          <w:tcPr>
+            <w:tcW w:type="dxa" w:w="3936"/>
+            <w:tcMar>
+              <w:top w:w="50" w:type="dxa"/>
+              <w:bottom w:w="50" w:type="dxa"/>
+              <w:left w:w="90" w:type="dxa"/>
+              <w:right w:w="90" w:type="dxa"/>
+            </w:tcMar>
+          </w:tcPr>
+          <w:p>
+            <w:pPr>
+              <w:pStyle w:val="BDOITable"/>
+            </w:pPr>
+            <w:r>
+              <w:rPr>
+                <w:sz w:val="16"/>
+              </w:rPr>
+              <w:t>ReportParametersTest</w:t>
+            </w:r>
+          </w:p>
+        </w:tc>
+        <w:tc>
+          <w:tcPr>
+            <w:tcW w:type="dxa" w:w="1050"/>
+            <w:tcMar>
+              <w:top w:w="50" w:type="dxa"/>
+              <w:bottom w:w="50" w:type="dxa"/>
+              <w:left w:w="90" w:type="dxa"/>
+              <w:right w:w="90" w:type="dxa"/>
+            </w:tcMar>
+          </w:tcPr>
+          <w:p>
+            <w:pPr>
+              <w:pStyle w:val="BDOITable"/>
+            </w:pPr>
+            <w:r>
+              <w:rPr>
+                <w:sz w:val="16"/>
+              </w:rPr>
+              <w:t>1</w:t>
             </w:r>
           </w:p>
         </w:tc>
@@ -27322,7 +27870,7 @@
         </w:trPr>
         <w:tc>
           <w:tcPr>
-            <w:tcW w:type="dxa" w:w="7835"/>
+            <w:tcW w:type="dxa" w:w="3936"/>
             <w:tcMar>
               <w:top w:w="50" w:type="dxa"/>
               <w:bottom w:w="50" w:type="dxa"/>
@@ -27337,7 +27885,7 @@
             </w:pPr>
             <w:r>
               <w:rPr>
-                <w:sz w:val="18"/>
+                <w:sz w:val="16"/>
               </w:rPr>
               <w:t>WorkflowServiceIT</w:t>
             </w:r>
@@ -27345,7 +27893,7 @@
         </w:tc>
         <w:tc>
           <w:tcPr>
-            <w:tcW w:type="dxa" w:w="2137"/>
+            <w:tcW w:type="dxa" w:w="1050"/>
             <w:tcMar>
               <w:top w:w="50" w:type="dxa"/>
               <w:bottom w:w="50" w:type="dxa"/>
@@ -27360,9 +27908,55 @@
             </w:pPr>
             <w:r>
               <w:rPr>
-                <w:sz w:val="18"/>
+                <w:sz w:val="16"/>
               </w:rPr>
               <w:t>4</w:t>
+            </w:r>
+          </w:p>
+        </w:tc>
+        <w:tc>
+          <w:tcPr>
+            <w:tcW w:type="dxa" w:w="3936"/>
+            <w:tcMar>
+              <w:top w:w="50" w:type="dxa"/>
+              <w:bottom w:w="50" w:type="dxa"/>
+              <w:left w:w="90" w:type="dxa"/>
+              <w:right w:w="90" w:type="dxa"/>
+            </w:tcMar>
+            <w:shd w:val="clear" w:color="auto" w:fill="E5F5FF"/>
+          </w:tcPr>
+          <w:p>
+            <w:pPr>
+              <w:pStyle w:val="BDOITable"/>
+            </w:pPr>
+            <w:r>
+              <w:rPr>
+                <w:sz w:val="16"/>
+              </w:rPr>
+              <w:t>UserAdminApiIT</w:t>
+            </w:r>
+          </w:p>
+        </w:tc>
+        <w:tc>
+          <w:tcPr>
+            <w:tcW w:type="dxa" w:w="1050"/>
+            <w:tcMar>
+              <w:top w:w="50" w:type="dxa"/>
+              <w:bottom w:w="50" w:type="dxa"/>
+              <w:left w:w="90" w:type="dxa"/>
+              <w:right w:w="90" w:type="dxa"/>
+            </w:tcMar>
+            <w:shd w:val="clear" w:color="auto" w:fill="E5F5FF"/>
+          </w:tcPr>
+          <w:p>
+            <w:pPr>
+              <w:pStyle w:val="BDOITable"/>
+            </w:pPr>
+            <w:r>
+              <w:rPr>
+                <w:sz w:val="16"/>
+              </w:rPr>
+              <w:t>1</w:t>
             </w:r>
           </w:p>
         </w:tc>
@@ -27373,21 +27967,21 @@
         </w:trPr>
         <w:tc>
           <w:tcPr>
-            <w:tcW w:type="dxa" w:w="7835"/>
-            <w:tcMar>
-              <w:top w:w="50" w:type="dxa"/>
-              <w:bottom w:w="50" w:type="dxa"/>
-              <w:left w:w="90" w:type="dxa"/>
-              <w:right w:w="90" w:type="dxa"/>
-            </w:tcMar>
-          </w:tcPr>
-          <w:p>
-            <w:pPr>
-              <w:pStyle w:val="BDOITable"/>
-            </w:pPr>
-            <w:r>
-              <w:rPr>
-                <w:sz w:val="18"/>
+            <w:tcW w:type="dxa" w:w="3936"/>
+            <w:tcMar>
+              <w:top w:w="50" w:type="dxa"/>
+              <w:bottom w:w="50" w:type="dxa"/>
+              <w:left w:w="90" w:type="dxa"/>
+              <w:right w:w="90" w:type="dxa"/>
+            </w:tcMar>
+          </w:tcPr>
+          <w:p>
+            <w:pPr>
+              <w:pStyle w:val="BDOITable"/>
+            </w:pPr>
+            <w:r>
+              <w:rPr>
+                <w:sz w:val="16"/>
               </w:rPr>
               <w:t>MessagingIT</w:t>
             </w:r>
@@ -27395,649 +27989,43 @@
         </w:tc>
         <w:tc>
           <w:tcPr>
-            <w:tcW w:type="dxa" w:w="2137"/>
-            <w:tcMar>
-              <w:top w:w="50" w:type="dxa"/>
-              <w:bottom w:w="50" w:type="dxa"/>
-              <w:left w:w="90" w:type="dxa"/>
-              <w:right w:w="90" w:type="dxa"/>
-            </w:tcMar>
-          </w:tcPr>
-          <w:p>
-            <w:pPr>
-              <w:pStyle w:val="BDOITable"/>
-            </w:pPr>
-            <w:r>
-              <w:rPr>
-                <w:sz w:val="18"/>
+            <w:tcW w:type="dxa" w:w="1050"/>
+            <w:tcMar>
+              <w:top w:w="50" w:type="dxa"/>
+              <w:bottom w:w="50" w:type="dxa"/>
+              <w:left w:w="90" w:type="dxa"/>
+              <w:right w:w="90" w:type="dxa"/>
+            </w:tcMar>
+          </w:tcPr>
+          <w:p>
+            <w:pPr>
+              <w:pStyle w:val="BDOITable"/>
+            </w:pPr>
+            <w:r>
+              <w:rPr>
+                <w:sz w:val="16"/>
               </w:rPr>
               <w:t>3</w:t>
             </w:r>
           </w:p>
         </w:tc>
-      </w:tr>
-      <w:tr>
-        <w:trPr>
-          <w:cantSplit w:val="true"/>
-        </w:trPr>
-        <w:tc>
-          <w:tcPr>
-            <w:tcW w:type="dxa" w:w="7835"/>
-            <w:tcMar>
-              <w:top w:w="50" w:type="dxa"/>
-              <w:bottom w:w="50" w:type="dxa"/>
-              <w:left w:w="90" w:type="dxa"/>
-              <w:right w:w="90" w:type="dxa"/>
-            </w:tcMar>
-            <w:shd w:val="clear" w:color="auto" w:fill="E5F5FF"/>
-          </w:tcPr>
-          <w:p>
-            <w:pPr>
-              <w:pStyle w:val="BDOITable"/>
-            </w:pPr>
-            <w:r>
-              <w:rPr>
-                <w:sz w:val="18"/>
-              </w:rPr>
-              <w:t>ProductMaintenanceFoundationIT</w:t>
-            </w:r>
-          </w:p>
-        </w:tc>
-        <w:tc>
-          <w:tcPr>
-            <w:tcW w:type="dxa" w:w="2137"/>
-            <w:tcMar>
-              <w:top w:w="50" w:type="dxa"/>
-              <w:bottom w:w="50" w:type="dxa"/>
-              <w:left w:w="90" w:type="dxa"/>
-              <w:right w:w="90" w:type="dxa"/>
-            </w:tcMar>
-            <w:shd w:val="clear" w:color="auto" w:fill="E5F5FF"/>
-          </w:tcPr>
-          <w:p>
-            <w:pPr>
-              <w:pStyle w:val="BDOITable"/>
-            </w:pPr>
-            <w:r>
-              <w:rPr>
-                <w:sz w:val="18"/>
-              </w:rPr>
-              <w:t>3</w:t>
-            </w:r>
-          </w:p>
-        </w:tc>
-      </w:tr>
-      <w:tr>
-        <w:trPr>
-          <w:cantSplit w:val="true"/>
-        </w:trPr>
-        <w:tc>
-          <w:tcPr>
-            <w:tcW w:type="dxa" w:w="7835"/>
-            <w:tcMar>
-              <w:top w:w="50" w:type="dxa"/>
-              <w:bottom w:w="50" w:type="dxa"/>
-              <w:left w:w="90" w:type="dxa"/>
-              <w:right w:w="90" w:type="dxa"/>
-            </w:tcMar>
-          </w:tcPr>
-          <w:p>
-            <w:pPr>
-              <w:pStyle w:val="BDOITable"/>
-            </w:pPr>
-            <w:r>
-              <w:rPr>
-                <w:sz w:val="18"/>
-              </w:rPr>
-              <w:t>productMaintenanceForms.test.ts</w:t>
-            </w:r>
-          </w:p>
-        </w:tc>
-        <w:tc>
-          <w:tcPr>
-            <w:tcW w:type="dxa" w:w="2137"/>
-            <w:tcMar>
-              <w:top w:w="50" w:type="dxa"/>
-              <w:bottom w:w="50" w:type="dxa"/>
-              <w:left w:w="90" w:type="dxa"/>
-              <w:right w:w="90" w:type="dxa"/>
-            </w:tcMar>
-          </w:tcPr>
-          <w:p>
-            <w:pPr>
-              <w:pStyle w:val="BDOITable"/>
-            </w:pPr>
-            <w:r>
-              <w:rPr>
-                <w:sz w:val="18"/>
-              </w:rPr>
-              <w:t>3</w:t>
-            </w:r>
-          </w:p>
-        </w:tc>
-      </w:tr>
-      <w:tr>
-        <w:trPr>
-          <w:cantSplit w:val="true"/>
-        </w:trPr>
-        <w:tc>
-          <w:tcPr>
-            <w:tcW w:type="dxa" w:w="7835"/>
-            <w:tcMar>
-              <w:top w:w="50" w:type="dxa"/>
-              <w:bottom w:w="50" w:type="dxa"/>
-              <w:left w:w="90" w:type="dxa"/>
-              <w:right w:w="90" w:type="dxa"/>
-            </w:tcMar>
-            <w:shd w:val="clear" w:color="auto" w:fill="E5F5FF"/>
-          </w:tcPr>
-          <w:p>
-            <w:pPr>
-              <w:pStyle w:val="BDOITable"/>
-            </w:pPr>
-            <w:r>
-              <w:rPr>
-                <w:sz w:val="18"/>
-              </w:rPr>
-              <w:t>AccessRequestIT</w:t>
-            </w:r>
-          </w:p>
-        </w:tc>
-        <w:tc>
-          <w:tcPr>
-            <w:tcW w:type="dxa" w:w="2137"/>
-            <w:tcMar>
-              <w:top w:w="50" w:type="dxa"/>
-              <w:bottom w:w="50" w:type="dxa"/>
-              <w:left w:w="90" w:type="dxa"/>
-              <w:right w:w="90" w:type="dxa"/>
-            </w:tcMar>
-            <w:shd w:val="clear" w:color="auto" w:fill="E5F5FF"/>
-          </w:tcPr>
-          <w:p>
-            <w:pPr>
-              <w:pStyle w:val="BDOITable"/>
-            </w:pPr>
-            <w:r>
-              <w:rPr>
-                <w:sz w:val="18"/>
-              </w:rPr>
-              <w:t>2</w:t>
-            </w:r>
-          </w:p>
-        </w:tc>
-      </w:tr>
-      <w:tr>
-        <w:trPr>
-          <w:cantSplit w:val="true"/>
-        </w:trPr>
-        <w:tc>
-          <w:tcPr>
-            <w:tcW w:type="dxa" w:w="7835"/>
-            <w:tcMar>
-              <w:top w:w="50" w:type="dxa"/>
-              <w:bottom w:w="50" w:type="dxa"/>
-              <w:left w:w="90" w:type="dxa"/>
-              <w:right w:w="90" w:type="dxa"/>
-            </w:tcMar>
-          </w:tcPr>
-          <w:p>
-            <w:pPr>
-              <w:pStyle w:val="BDOITable"/>
-            </w:pPr>
-            <w:r>
-              <w:rPr>
-                <w:sz w:val="18"/>
-              </w:rPr>
-              <w:t>ApiSmokeIT</w:t>
-            </w:r>
-          </w:p>
-        </w:tc>
-        <w:tc>
-          <w:tcPr>
-            <w:tcW w:type="dxa" w:w="2137"/>
-            <w:tcMar>
-              <w:top w:w="50" w:type="dxa"/>
-              <w:bottom w:w="50" w:type="dxa"/>
-              <w:left w:w="90" w:type="dxa"/>
-              <w:right w:w="90" w:type="dxa"/>
-            </w:tcMar>
-          </w:tcPr>
-          <w:p>
-            <w:pPr>
-              <w:pStyle w:val="BDOITable"/>
-            </w:pPr>
-            <w:r>
-              <w:rPr>
-                <w:sz w:val="18"/>
-              </w:rPr>
-              <w:t>2</w:t>
-            </w:r>
-          </w:p>
-        </w:tc>
-      </w:tr>
-      <w:tr>
-        <w:trPr>
-          <w:cantSplit w:val="true"/>
-        </w:trPr>
-        <w:tc>
-          <w:tcPr>
-            <w:tcW w:type="dxa" w:w="7835"/>
-            <w:tcMar>
-              <w:top w:w="50" w:type="dxa"/>
-              <w:bottom w:w="50" w:type="dxa"/>
-              <w:left w:w="90" w:type="dxa"/>
-              <w:right w:w="90" w:type="dxa"/>
-            </w:tcMar>
-            <w:shd w:val="clear" w:color="auto" w:fill="E5F5FF"/>
-          </w:tcPr>
-          <w:p>
-            <w:pPr>
-              <w:pStyle w:val="BDOITable"/>
-            </w:pPr>
-            <w:r>
-              <w:rPr>
-                <w:sz w:val="18"/>
-              </w:rPr>
-              <w:t>LoginLockoutTest</w:t>
-            </w:r>
-          </w:p>
-        </w:tc>
-        <w:tc>
-          <w:tcPr>
-            <w:tcW w:type="dxa" w:w="2137"/>
-            <w:tcMar>
-              <w:top w:w="50" w:type="dxa"/>
-              <w:bottom w:w="50" w:type="dxa"/>
-              <w:left w:w="90" w:type="dxa"/>
-              <w:right w:w="90" w:type="dxa"/>
-            </w:tcMar>
-            <w:shd w:val="clear" w:color="auto" w:fill="E5F5FF"/>
-          </w:tcPr>
-          <w:p>
-            <w:pPr>
-              <w:pStyle w:val="BDOITable"/>
-            </w:pPr>
-            <w:r>
-              <w:rPr>
-                <w:sz w:val="18"/>
-              </w:rPr>
-              <w:t>2</w:t>
-            </w:r>
-          </w:p>
-        </w:tc>
-      </w:tr>
-      <w:tr>
-        <w:trPr>
-          <w:cantSplit w:val="true"/>
-        </w:trPr>
-        <w:tc>
-          <w:tcPr>
-            <w:tcW w:type="dxa" w:w="7835"/>
-            <w:tcMar>
-              <w:top w:w="50" w:type="dxa"/>
-              <w:bottom w:w="50" w:type="dxa"/>
-              <w:left w:w="90" w:type="dxa"/>
-              <w:right w:w="90" w:type="dxa"/>
-            </w:tcMar>
-          </w:tcPr>
-          <w:p>
-            <w:pPr>
-              <w:pStyle w:val="BDOITable"/>
-            </w:pPr>
-            <w:r>
-              <w:rPr>
-                <w:sz w:val="18"/>
-              </w:rPr>
-              <w:t>AuditTrailImmutabilityIT</w:t>
-            </w:r>
-          </w:p>
-        </w:tc>
-        <w:tc>
-          <w:tcPr>
-            <w:tcW w:type="dxa" w:w="2137"/>
-            <w:tcMar>
-              <w:top w:w="50" w:type="dxa"/>
-              <w:bottom w:w="50" w:type="dxa"/>
-              <w:left w:w="90" w:type="dxa"/>
-              <w:right w:w="90" w:type="dxa"/>
-            </w:tcMar>
-          </w:tcPr>
-          <w:p>
-            <w:pPr>
-              <w:pStyle w:val="BDOITable"/>
-            </w:pPr>
-            <w:r>
-              <w:rPr>
-                <w:sz w:val="18"/>
-              </w:rPr>
-              <w:t>1</w:t>
-            </w:r>
-          </w:p>
-        </w:tc>
-      </w:tr>
-      <w:tr>
-        <w:trPr>
-          <w:cantSplit w:val="true"/>
-        </w:trPr>
-        <w:tc>
-          <w:tcPr>
-            <w:tcW w:type="dxa" w:w="7835"/>
-            <w:tcMar>
-              <w:top w:w="50" w:type="dxa"/>
-              <w:bottom w:w="50" w:type="dxa"/>
-              <w:left w:w="90" w:type="dxa"/>
-              <w:right w:w="90" w:type="dxa"/>
-            </w:tcMar>
-            <w:shd w:val="clear" w:color="auto" w:fill="E5F5FF"/>
-          </w:tcPr>
-          <w:p>
-            <w:pPr>
-              <w:pStyle w:val="BDOITable"/>
-            </w:pPr>
-            <w:r>
-              <w:rPr>
-                <w:sz w:val="18"/>
-              </w:rPr>
-              <w:t>DocTemplateServiceIT</w:t>
-            </w:r>
-          </w:p>
-        </w:tc>
-        <w:tc>
-          <w:tcPr>
-            <w:tcW w:type="dxa" w:w="2137"/>
-            <w:tcMar>
-              <w:top w:w="50" w:type="dxa"/>
-              <w:bottom w:w="50" w:type="dxa"/>
-              <w:left w:w="90" w:type="dxa"/>
-              <w:right w:w="90" w:type="dxa"/>
-            </w:tcMar>
-            <w:shd w:val="clear" w:color="auto" w:fill="E5F5FF"/>
-          </w:tcPr>
-          <w:p>
-            <w:pPr>
-              <w:pStyle w:val="BDOITable"/>
-            </w:pPr>
-            <w:r>
-              <w:rPr>
-                <w:sz w:val="18"/>
-              </w:rPr>
-              <w:t>1</w:t>
-            </w:r>
-          </w:p>
-        </w:tc>
-      </w:tr>
-      <w:tr>
-        <w:trPr>
-          <w:cantSplit w:val="true"/>
-        </w:trPr>
-        <w:tc>
-          <w:tcPr>
-            <w:tcW w:type="dxa" w:w="7835"/>
-            <w:tcMar>
-              <w:top w:w="50" w:type="dxa"/>
-              <w:bottom w:w="50" w:type="dxa"/>
-              <w:left w:w="90" w:type="dxa"/>
-              <w:right w:w="90" w:type="dxa"/>
-            </w:tcMar>
-          </w:tcPr>
-          <w:p>
-            <w:pPr>
-              <w:pStyle w:val="BDOITable"/>
-            </w:pPr>
-            <w:r>
-              <w:rPr>
-                <w:sz w:val="18"/>
-              </w:rPr>
-              <w:t>LogoutIT</w:t>
-            </w:r>
-          </w:p>
-        </w:tc>
-        <w:tc>
-          <w:tcPr>
-            <w:tcW w:type="dxa" w:w="2137"/>
-            <w:tcMar>
-              <w:top w:w="50" w:type="dxa"/>
-              <w:bottom w:w="50" w:type="dxa"/>
-              <w:left w:w="90" w:type="dxa"/>
-              <w:right w:w="90" w:type="dxa"/>
-            </w:tcMar>
-          </w:tcPr>
-          <w:p>
-            <w:pPr>
-              <w:pStyle w:val="BDOITable"/>
-            </w:pPr>
-            <w:r>
-              <w:rPr>
-                <w:sz w:val="18"/>
-              </w:rPr>
-              <w:t>1</w:t>
-            </w:r>
-          </w:p>
-        </w:tc>
-      </w:tr>
-      <w:tr>
-        <w:trPr>
-          <w:cantSplit w:val="true"/>
-        </w:trPr>
-        <w:tc>
-          <w:tcPr>
-            <w:tcW w:type="dxa" w:w="7835"/>
-            <w:tcMar>
-              <w:top w:w="50" w:type="dxa"/>
-              <w:bottom w:w="50" w:type="dxa"/>
-              <w:left w:w="90" w:type="dxa"/>
-              <w:right w:w="90" w:type="dxa"/>
-            </w:tcMar>
-            <w:shd w:val="clear" w:color="auto" w:fill="E5F5FF"/>
-          </w:tcPr>
-          <w:p>
-            <w:pPr>
-              <w:pStyle w:val="BDOITable"/>
-            </w:pPr>
-            <w:r>
-              <w:rPr>
-                <w:sz w:val="18"/>
-              </w:rPr>
-              <w:t>NbReportApiIT</w:t>
-            </w:r>
-          </w:p>
-        </w:tc>
-        <w:tc>
-          <w:tcPr>
-            <w:tcW w:type="dxa" w:w="2137"/>
-            <w:tcMar>
-              <w:top w:w="50" w:type="dxa"/>
-              <w:bottom w:w="50" w:type="dxa"/>
-              <w:left w:w="90" w:type="dxa"/>
-              <w:right w:w="90" w:type="dxa"/>
-            </w:tcMar>
-            <w:shd w:val="clear" w:color="auto" w:fill="E5F5FF"/>
-          </w:tcPr>
-          <w:p>
-            <w:pPr>
-              <w:pStyle w:val="BDOITable"/>
-            </w:pPr>
-            <w:r>
-              <w:rPr>
-                <w:sz w:val="18"/>
-              </w:rPr>
-              <w:t>1</w:t>
-            </w:r>
-          </w:p>
-        </w:tc>
-      </w:tr>
-      <w:tr>
-        <w:trPr>
-          <w:cantSplit w:val="true"/>
-        </w:trPr>
-        <w:tc>
-          <w:tcPr>
-            <w:tcW w:type="dxa" w:w="7835"/>
-            <w:tcMar>
-              <w:top w:w="50" w:type="dxa"/>
-              <w:bottom w:w="50" w:type="dxa"/>
-              <w:left w:w="90" w:type="dxa"/>
-              <w:right w:w="90" w:type="dxa"/>
-            </w:tcMar>
-          </w:tcPr>
-          <w:p>
-            <w:pPr>
-              <w:pStyle w:val="BDOITable"/>
-            </w:pPr>
-            <w:r>
-              <w:rPr>
-                <w:sz w:val="18"/>
-              </w:rPr>
-              <w:t>OperationsFoundationApiIT</w:t>
-            </w:r>
-          </w:p>
-        </w:tc>
-        <w:tc>
-          <w:tcPr>
-            <w:tcW w:type="dxa" w:w="2137"/>
-            <w:tcMar>
-              <w:top w:w="50" w:type="dxa"/>
-              <w:bottom w:w="50" w:type="dxa"/>
-              <w:left w:w="90" w:type="dxa"/>
-              <w:right w:w="90" w:type="dxa"/>
-            </w:tcMar>
-          </w:tcPr>
-          <w:p>
-            <w:pPr>
-              <w:pStyle w:val="BDOITable"/>
-            </w:pPr>
-            <w:r>
-              <w:rPr>
-                <w:sz w:val="18"/>
-              </w:rPr>
-              <w:t>1</w:t>
-            </w:r>
-          </w:p>
-        </w:tc>
-      </w:tr>
-      <w:tr>
-        <w:trPr>
-          <w:cantSplit w:val="true"/>
-        </w:trPr>
-        <w:tc>
-          <w:tcPr>
-            <w:tcW w:type="dxa" w:w="7835"/>
-            <w:tcMar>
-              <w:top w:w="50" w:type="dxa"/>
-              <w:bottom w:w="50" w:type="dxa"/>
-              <w:left w:w="90" w:type="dxa"/>
-              <w:right w:w="90" w:type="dxa"/>
-            </w:tcMar>
-            <w:shd w:val="clear" w:color="auto" w:fill="E5F5FF"/>
-          </w:tcPr>
-          <w:p>
-            <w:pPr>
-              <w:pStyle w:val="BDOITable"/>
-            </w:pPr>
-            <w:r>
-              <w:rPr>
-                <w:sz w:val="18"/>
-              </w:rPr>
-              <w:t>ReportParametersTest</w:t>
-            </w:r>
-          </w:p>
-        </w:tc>
-        <w:tc>
-          <w:tcPr>
-            <w:tcW w:type="dxa" w:w="2137"/>
-            <w:tcMar>
-              <w:top w:w="50" w:type="dxa"/>
-              <w:bottom w:w="50" w:type="dxa"/>
-              <w:left w:w="90" w:type="dxa"/>
-              <w:right w:w="90" w:type="dxa"/>
-            </w:tcMar>
-            <w:shd w:val="clear" w:color="auto" w:fill="E5F5FF"/>
-          </w:tcPr>
-          <w:p>
-            <w:pPr>
-              <w:pStyle w:val="BDOITable"/>
-            </w:pPr>
-            <w:r>
-              <w:rPr>
-                <w:sz w:val="18"/>
-              </w:rPr>
-              <w:t>1</w:t>
-            </w:r>
-          </w:p>
-        </w:tc>
-      </w:tr>
-      <w:tr>
-        <w:trPr>
-          <w:cantSplit w:val="true"/>
-        </w:trPr>
-        <w:tc>
-          <w:tcPr>
-            <w:tcW w:type="dxa" w:w="7835"/>
-            <w:tcMar>
-              <w:top w:w="50" w:type="dxa"/>
-              <w:bottom w:w="50" w:type="dxa"/>
-              <w:left w:w="90" w:type="dxa"/>
-              <w:right w:w="90" w:type="dxa"/>
-            </w:tcMar>
-          </w:tcPr>
-          <w:p>
-            <w:pPr>
-              <w:pStyle w:val="BDOITable"/>
-            </w:pPr>
-            <w:r>
-              <w:rPr>
-                <w:sz w:val="18"/>
-              </w:rPr>
-              <w:t>UserAdminApiIT</w:t>
-            </w:r>
-          </w:p>
-        </w:tc>
-        <w:tc>
-          <w:tcPr>
-            <w:tcW w:type="dxa" w:w="2137"/>
-            <w:tcMar>
-              <w:top w:w="50" w:type="dxa"/>
-              <w:bottom w:w="50" w:type="dxa"/>
-              <w:left w:w="90" w:type="dxa"/>
-              <w:right w:w="90" w:type="dxa"/>
-            </w:tcMar>
-          </w:tcPr>
-          <w:p>
-            <w:pPr>
-              <w:pStyle w:val="BDOITable"/>
-            </w:pPr>
-            <w:r>
-              <w:rPr>
-                <w:sz w:val="18"/>
-              </w:rPr>
-              <w:t>1</w:t>
-            </w:r>
-          </w:p>
-        </w:tc>
-      </w:tr>
-      <w:tr>
-        <w:trPr>
-          <w:cantSplit w:val="true"/>
-        </w:trPr>
-        <w:tc>
-          <w:tcPr>
-            <w:tcW w:type="dxa" w:w="7835"/>
-            <w:tcMar>
-              <w:top w:w="50" w:type="dxa"/>
-              <w:bottom w:w="50" w:type="dxa"/>
-              <w:left w:w="90" w:type="dxa"/>
-              <w:right w:w="90" w:type="dxa"/>
-            </w:tcMar>
-            <w:shd w:val="clear" w:color="auto" w:fill="E5F5FF"/>
-          </w:tcPr>
-          <w:p>
-            <w:pPr>
-              <w:pStyle w:val="BDOITable"/>
-            </w:pPr>
-            <w:r>
-              <w:rPr>
-                <w:sz w:val="18"/>
+        <w:tc>
+          <w:tcPr>
+            <w:tcW w:type="dxa" w:w="3936"/>
+            <w:tcMar>
+              <w:top w:w="50" w:type="dxa"/>
+              <w:bottom w:w="50" w:type="dxa"/>
+              <w:left w:w="90" w:type="dxa"/>
+              <w:right w:w="90" w:type="dxa"/>
+            </w:tcMar>
+          </w:tcPr>
+          <w:p>
+            <w:pPr>
+              <w:pStyle w:val="BDOITable"/>
+            </w:pPr>
+            <w:r>
+              <w:rPr>
+                <w:sz w:val="16"/>
               </w:rPr>
               <w:t>accessRequest.test.ts</w:t>
             </w:r>
@@ -28045,22 +28033,21 @@
         </w:tc>
         <w:tc>
           <w:tcPr>
-            <w:tcW w:type="dxa" w:w="2137"/>
-            <w:tcMar>
-              <w:top w:w="50" w:type="dxa"/>
-              <w:bottom w:w="50" w:type="dxa"/>
-              <w:left w:w="90" w:type="dxa"/>
-              <w:right w:w="90" w:type="dxa"/>
-            </w:tcMar>
-            <w:shd w:val="clear" w:color="auto" w:fill="E5F5FF"/>
-          </w:tcPr>
-          <w:p>
-            <w:pPr>
-              <w:pStyle w:val="BDOITable"/>
-            </w:pPr>
-            <w:r>
-              <w:rPr>
-                <w:sz w:val="18"/>
+            <w:tcW w:type="dxa" w:w="1050"/>
+            <w:tcMar>
+              <w:top w:w="50" w:type="dxa"/>
+              <w:bottom w:w="50" w:type="dxa"/>
+              <w:left w:w="90" w:type="dxa"/>
+              <w:right w:w="90" w:type="dxa"/>
+            </w:tcMar>
+          </w:tcPr>
+          <w:p>
+            <w:pPr>
+              <w:pStyle w:val="BDOITable"/>
+            </w:pPr>
+            <w:r>
+              <w:rPr>
+                <w:sz w:val="16"/>
               </w:rPr>
               <w:t>1</w:t>
             </w:r>
@@ -29526,7 +29513,7 @@
               <w:rPr>
                 <w:sz w:val="17"/>
               </w:rPr>
-              <w:t>The FRS gives the log-in and lock-out messages without codes and the threshold only as "configured". The build locks at 5 failed attempts by default and the log-in endpoint also rate-limits (LOGIN_RATE_LIMITED, HTTP 429), which the FRS does not mention.</w:t>
+              <w:t>The FRS messages "Invalid user ID or password" and "Your account is locked. Contact the System Administrator" differ from the build ("Invalid user name or password", "Account is locked. Contact your administrator.", code AUTHENTICATION_FAILED). The threshold is given only as "configured"; the build reads LOGIN_MAX_FAILED_ATTEMPTS (3 as delivered). The log-in endpoint also rate-limits (LOGIN_RATE_LIMITED, HTTP 429), which the FRS does not mention.</w:t>
             </w:r>
           </w:p>
         </w:tc>
@@ -29548,7 +29535,7 @@
               <w:rPr>
                 <w:sz w:val="17"/>
               </w:rPr>
-              <w:t>Name the parameter and default of the lock-out threshold and add the rate limit to FR-PM-001.</w:t>
+              <w:t>Quote the built messages and code, name the parameter and its value, and add the rate limit to FR-PM-001.</w:t>
             </w:r>
           </w:p>
         </w:tc>

</xml_diff>